<commit_message>
docs: update video presentation script word document to parallel action-speech format
</commit_message>
<xml_diff>
--- a/Guion_Video_Demostrativo_FoodStore.docx
+++ b/Guion_Video_Demostrativo_FoodStore.docx
@@ -4,29 +4,29 @@
   <w:body>
     <w:p>
       <w:pPr>
-        <w:spacing w:before="0" w:after="80"/>
+        <w:spacing w:before="0" w:after="40"/>
       </w:pPr>
       <w:r>
         <w:rPr>
           <w:rFonts w:ascii="Calibri" w:hAnsi="Calibri"/>
           <w:b/>
           <w:color w:val="D97706"/>
-          <w:sz w:val="44"/>
+          <w:sz w:val="40"/>
         </w:rPr>
-        <w:t>GUION DE GRABACIÓN - VIDEO DEMOSTRATIVO</w:t>
+        <w:t>GUION SECUENCIAL DE GRABACIÓN PASO A PASO</w:t>
       </w:r>
     </w:p>
     <w:p>
       <w:pPr>
-        <w:spacing w:after="320"/>
+        <w:spacing w:after="280"/>
       </w:pPr>
       <w:r>
         <w:rPr>
           <w:b/>
           <w:color w:val="1C1917"/>
-          <w:sz w:val="28"/>
+          <w:sz w:val="26"/>
         </w:rPr>
-        <w:t>Food Store - Sistema de Pedidos y Delivery Gastronómico</w:t>
+        <w:t>Food Store - Trabajo Práctico Integrador de Programación IV (UTN)</w:t>
       </w:r>
     </w:p>
     <w:tbl>
@@ -46,10 +46,10 @@
             <w:tcW w:type="dxa" w:w="2880"/>
             <w:shd w:fill="F5F5F4"/>
             <w:tcMar>
-              <w:top w:w="80" w:type="dxa"/>
-              <w:bottom w:w="80" w:type="dxa"/>
-              <w:left w:w="120" w:type="dxa"/>
-              <w:right w:w="120" w:type="dxa"/>
+              <w:top w:w="70" w:type="dxa"/>
+              <w:bottom w:w="70" w:type="dxa"/>
+              <w:left w:w="100" w:type="dxa"/>
+              <w:right w:w="100" w:type="dxa"/>
             </w:tcMar>
           </w:tcPr>
           <w:p>
@@ -70,10 +70,10 @@
             <w:tcW w:type="dxa" w:w="6480"/>
             <w:shd w:fill="FAFAF9"/>
             <w:tcMar>
-              <w:top w:w="80" w:type="dxa"/>
-              <w:bottom w:w="80" w:type="dxa"/>
-              <w:left w:w="120" w:type="dxa"/>
-              <w:right w:w="120" w:type="dxa"/>
+              <w:top w:w="70" w:type="dxa"/>
+              <w:bottom w:w="70" w:type="dxa"/>
+              <w:left w:w="100" w:type="dxa"/>
+              <w:right w:w="100" w:type="dxa"/>
             </w:tcMar>
           </w:tcPr>
           <w:p>
@@ -84,7 +84,7 @@
               <w:rPr>
                 <w:sz w:val="19"/>
               </w:rPr>
-              <w:t>Programación IV - Tecnicatura Universitaria en Programación de Sistemas (UTN)</w:t>
+              <w:t>Programación IV - Tecnicatura Universitaria en Programación (UTN)</w:t>
             </w:r>
           </w:p>
         </w:tc>
@@ -95,10 +95,10 @@
             <w:tcW w:type="dxa" w:w="2880"/>
             <w:shd w:fill="F5F5F4"/>
             <w:tcMar>
-              <w:top w:w="80" w:type="dxa"/>
-              <w:bottom w:w="80" w:type="dxa"/>
-              <w:left w:w="120" w:type="dxa"/>
-              <w:right w:w="120" w:type="dxa"/>
+              <w:top w:w="70" w:type="dxa"/>
+              <w:bottom w:w="70" w:type="dxa"/>
+              <w:left w:w="100" w:type="dxa"/>
+              <w:right w:w="100" w:type="dxa"/>
             </w:tcMar>
           </w:tcPr>
           <w:p>
@@ -119,10 +119,10 @@
             <w:tcW w:type="dxa" w:w="6480"/>
             <w:shd w:fill="FAFAF9"/>
             <w:tcMar>
-              <w:top w:w="80" w:type="dxa"/>
-              <w:bottom w:w="80" w:type="dxa"/>
-              <w:left w:w="120" w:type="dxa"/>
-              <w:right w:w="120" w:type="dxa"/>
+              <w:top w:w="70" w:type="dxa"/>
+              <w:bottom w:w="70" w:type="dxa"/>
+              <w:left w:w="100" w:type="dxa"/>
+              <w:right w:w="100" w:type="dxa"/>
             </w:tcMar>
           </w:tcPr>
           <w:p>
@@ -144,10 +144,10 @@
             <w:tcW w:type="dxa" w:w="2880"/>
             <w:shd w:fill="F5F5F4"/>
             <w:tcMar>
-              <w:top w:w="80" w:type="dxa"/>
-              <w:bottom w:w="80" w:type="dxa"/>
-              <w:left w:w="120" w:type="dxa"/>
-              <w:right w:w="120" w:type="dxa"/>
+              <w:top w:w="70" w:type="dxa"/>
+              <w:bottom w:w="70" w:type="dxa"/>
+              <w:left w:w="100" w:type="dxa"/>
+              <w:right w:w="100" w:type="dxa"/>
             </w:tcMar>
           </w:tcPr>
           <w:p>
@@ -168,10 +168,10 @@
             <w:tcW w:type="dxa" w:w="6480"/>
             <w:shd w:fill="FAFAF9"/>
             <w:tcMar>
-              <w:top w:w="80" w:type="dxa"/>
-              <w:bottom w:w="80" w:type="dxa"/>
-              <w:left w:w="120" w:type="dxa"/>
-              <w:right w:w="120" w:type="dxa"/>
+              <w:top w:w="70" w:type="dxa"/>
+              <w:bottom w:w="70" w:type="dxa"/>
+              <w:left w:w="100" w:type="dxa"/>
+              <w:right w:w="100" w:type="dxa"/>
             </w:tcMar>
           </w:tcPr>
           <w:p>
@@ -193,10 +193,10 @@
             <w:tcW w:type="dxa" w:w="2880"/>
             <w:shd w:fill="F5F5F4"/>
             <w:tcMar>
-              <w:top w:w="80" w:type="dxa"/>
-              <w:bottom w:w="80" w:type="dxa"/>
-              <w:left w:w="120" w:type="dxa"/>
-              <w:right w:w="120" w:type="dxa"/>
+              <w:top w:w="70" w:type="dxa"/>
+              <w:bottom w:w="70" w:type="dxa"/>
+              <w:left w:w="100" w:type="dxa"/>
+              <w:right w:w="100" w:type="dxa"/>
             </w:tcMar>
           </w:tcPr>
           <w:p>
@@ -208,7 +208,7 @@
                 <w:b/>
                 <w:sz w:val="19"/>
               </w:rPr>
-              <w:t>Duración Estimada:</w:t>
+              <w:t>Estructura del Guion:</w:t>
             </w:r>
           </w:p>
         </w:tc>
@@ -217,10 +217,10 @@
             <w:tcW w:type="dxa" w:w="6480"/>
             <w:shd w:fill="FAFAF9"/>
             <w:tcMar>
-              <w:top w:w="80" w:type="dxa"/>
-              <w:bottom w:w="80" w:type="dxa"/>
-              <w:left w:w="120" w:type="dxa"/>
-              <w:right w:w="120" w:type="dxa"/>
+              <w:top w:w="70" w:type="dxa"/>
+              <w:bottom w:w="70" w:type="dxa"/>
+              <w:left w:w="100" w:type="dxa"/>
+              <w:right w:w="100" w:type="dxa"/>
             </w:tcMar>
           </w:tcPr>
           <w:p>
@@ -231,7 +231,7 @@
               <w:rPr>
                 <w:sz w:val="19"/>
               </w:rPr>
-              <w:t>7 a 10 minutos (Ritmo pausado y claro)</w:t>
+              <w:t>Formato en Paralelo: [Acción en Pantalla] seguido inmediatamente de [Lo que decís]</w:t>
             </w:r>
           </w:p>
         </w:tc>
@@ -239,104 +239,93 @@
     </w:tbl>
     <w:p>
       <w:pPr>
+        <w:spacing w:after="200"/>
+      </w:pPr>
+    </w:p>
+    <w:p>
+      <w:pPr>
+        <w:spacing w:before="200" w:after="80"/>
+      </w:pPr>
+      <w:r>
+        <w:rPr>
+          <w:b/>
+          <w:color w:val="B45309"/>
+          <w:sz w:val="24"/>
+        </w:rPr>
+        <w:t>📋 Preparación Previa (Tener listo antes de presionar REC):</w:t>
+      </w:r>
+    </w:p>
+    <w:p>
+      <w:pPr>
+        <w:pStyle w:val="ListBullet"/>
+        <w:spacing w:after="40"/>
+      </w:pPr>
+      <w:r>
+        <w:rPr>
+          <w:sz w:val="19"/>
+        </w:rPr>
+        <w:t>Terminal 1: En carpeta backend con entorno activado (.venv\Scripts\activate).</w:t>
+      </w:r>
+    </w:p>
+    <w:p>
+      <w:pPr>
+        <w:pStyle w:val="ListBullet"/>
+        <w:spacing w:after="40"/>
+      </w:pPr>
+      <w:r>
+        <w:rPr>
+          <w:sz w:val="19"/>
+        </w:rPr>
+        <w:t>Terminal 2: En carpeta frontend lista para ejecutar pnpm build y pnpm dev.</w:t>
+      </w:r>
+    </w:p>
+    <w:p>
+      <w:pPr>
+        <w:pStyle w:val="ListBullet"/>
+        <w:spacing w:after="40"/>
+      </w:pPr>
+      <w:r>
+        <w:rPr>
+          <w:sz w:val="19"/>
+        </w:rPr>
+        <w:t>Pestañas del Navegador: Tab 1 en http://localhost:5173 (Food Store), Tab 2 en http://localhost:8000/docs (Swagger), Tab 3 con GitHub.</w:t>
+      </w:r>
+    </w:p>
+    <w:p>
+      <w:pPr>
+        <w:pStyle w:val="ListBullet"/>
+        <w:spacing w:after="40"/>
+      </w:pPr>
+      <w:r>
+        <w:rPr>
+          <w:sz w:val="19"/>
+        </w:rPr>
+        <w:t>VS Code: Abierto en la raíz del proyecto para mostrar la estructura por capas y código clave.</w:t>
+      </w:r>
+    </w:p>
+    <w:p>
+      <w:pPr>
         <w:spacing w:after="240"/>
       </w:pPr>
     </w:p>
     <w:p>
       <w:pPr>
-        <w:spacing w:before="280" w:after="120"/>
-      </w:pPr>
-      <w:r>
-        <w:rPr>
-          <w:b/>
-          <w:color w:val="B45309"/>
-          <w:sz w:val="28"/>
-        </w:rPr>
-        <w:t>1. Preparación Previa (Antes de Iniciar la Grabación)</w:t>
-      </w:r>
-    </w:p>
-    <w:p>
-      <w:pPr>
-        <w:pStyle w:val="ListBullet"/>
-        <w:spacing w:after="60"/>
-      </w:pPr>
-      <w:r>
-        <w:rPr>
-          <w:b/>
-        </w:rPr>
-        <w:t xml:space="preserve">Terminal 1 (Backend): </w:t>
-      </w:r>
-      <w:r>
-        <w:t>Ubicada en la carpeta backend con el entorno virtual activado (.venv\Scripts\activate).</w:t>
-      </w:r>
-    </w:p>
-    <w:p>
-      <w:pPr>
-        <w:pStyle w:val="ListBullet"/>
-        <w:spacing w:after="60"/>
-      </w:pPr>
-      <w:r>
-        <w:rPr>
-          <w:b/>
-        </w:rPr>
-        <w:t xml:space="preserve">Terminal 2 (Frontend): </w:t>
-      </w:r>
-      <w:r>
-        <w:t>Ubicada en la carpeta frontend lista para ejecutar pnpm build y pnpm dev.</w:t>
-      </w:r>
-    </w:p>
-    <w:p>
-      <w:pPr>
-        <w:pStyle w:val="ListBullet"/>
-        <w:spacing w:after="60"/>
-      </w:pPr>
-      <w:r>
-        <w:rPr>
-          <w:b/>
-        </w:rPr>
-        <w:t xml:space="preserve">Pestañas del Navegador: </w:t>
-      </w:r>
-      <w:r>
-        <w:t>Pestaña 1 en http://localhost:5173 (Food Store), Pestaña 2 en http://localhost:8000/docs (Swagger), Pestaña 3 con el repositorio de GitHub.</w:t>
-      </w:r>
-    </w:p>
-    <w:p>
-      <w:pPr>
-        <w:pStyle w:val="ListBullet"/>
-        <w:spacing w:after="60"/>
-      </w:pPr>
-      <w:r>
-        <w:rPr>
-          <w:b/>
-        </w:rPr>
-        <w:t xml:space="preserve">Editor de Código: </w:t>
-      </w:r>
-      <w:r>
-        <w:t>VS Code abierto en la raíz con los archivos unit_of_work.py, service.py y authStore.ts a mano.</w:t>
-      </w:r>
-    </w:p>
-    <w:p>
-      <w:pPr>
-        <w:spacing w:after="200"/>
-      </w:pPr>
-    </w:p>
-    <w:p>
-      <w:pPr>
-        <w:spacing w:before="320" w:after="80"/>
+        <w:spacing w:before="280" w:after="80"/>
       </w:pPr>
       <w:r>
         <w:rPr>
           <w:b/>
           <w:color w:val="92400E"/>
-          <w:sz w:val="26"/>
+          <w:sz w:val="24"/>
         </w:rPr>
-        <w:t>Bloque 1: Presentación y Arquitectura General (0:00 - 1:30)</w:t>
+        <w:t>Paso 1: Bienvenida e Introducción Institucional</w:t>
       </w:r>
     </w:p>
     <w:tbl>
       <w:tblPr>
         <w:tblW w:type="auto" w:w="0"/>
         <w:jc w:val="center"/>
+        <w:tblLayout w:type="fixed"/>
         <w:tblLook w:firstColumn="1" w:firstRow="1" w:lastColumn="0" w:lastRow="0" w:noHBand="0" w:noVBand="1" w:val="04A0"/>
       </w:tblPr>
       <w:tblGrid>
@@ -348,6 +337,39 @@
             <w:tcW w:type="dxa" w:w="9360"/>
             <w:shd w:fill="EFF6FF"/>
             <w:tcMar>
+              <w:top w:w="80" w:type="dxa"/>
+              <w:bottom w:w="80" w:type="dxa"/>
+              <w:left w:w="120" w:type="dxa"/>
+              <w:right w:w="120" w:type="dxa"/>
+            </w:tcMar>
+          </w:tcPr>
+          <w:p>
+            <w:pPr>
+              <w:spacing w:after="40"/>
+            </w:pPr>
+            <w:r>
+              <w:rPr>
+                <w:b/>
+                <w:color w:val="1D4ED8"/>
+                <w:sz w:val="19"/>
+              </w:rPr>
+              <w:t xml:space="preserve">🖥️ EN PANTALLA (LO QUE HACES): </w:t>
+            </w:r>
+            <w:r>
+              <w:rPr>
+                <w:sz w:val="19"/>
+              </w:rPr>
+              <w:t>Mostrá la portada de la aplicación web en el navegador (http://localhost:5173) o la cámara con el título del proyecto.</w:t>
+            </w:r>
+          </w:p>
+        </w:tc>
+      </w:tr>
+      <w:tr>
+        <w:tc>
+          <w:tcPr>
+            <w:tcW w:type="dxa" w:w="9360"/>
+            <w:shd w:fill="FEF3C7"/>
+            <w:tcMar>
               <w:top w:w="100" w:type="dxa"/>
               <w:bottom w:w="100" w:type="dxa"/>
               <w:left w:w="140" w:type="dxa"/>
@@ -356,93 +378,15 @@
           </w:tcPr>
           <w:p>
             <w:pPr>
-              <w:spacing w:after="80"/>
-            </w:pPr>
-            <w:r>
-              <w:rPr>
-                <w:b/>
-                <w:color w:val="1D4ED8"/>
-                <w:sz w:val="20"/>
-              </w:rPr>
-              <w:t>🖥️ QUÉ MOSTRAR EN PANTALLA:</w:t>
-            </w:r>
-          </w:p>
-          <w:p>
-            <w:pPr>
-              <w:pStyle w:val="ListBullet"/>
               <w:spacing w:after="40"/>
-            </w:pPr>
-            <w:r>
-              <w:rPr>
-                <w:sz w:val="19"/>
-              </w:rPr>
-              <w:t>Cámara web encendida o portada del navegador con el README.md.</w:t>
-            </w:r>
-          </w:p>
-          <w:p>
-            <w:pPr>
-              <w:pStyle w:val="ListBullet"/>
-              <w:spacing w:after="40"/>
-            </w:pPr>
-            <w:r>
-              <w:rPr>
-                <w:sz w:val="19"/>
-              </w:rPr>
-              <w:t>Mostrar la estructura en capas en VS Code: app/core, app/modules (auth, categorias, pedidos, productos, usuarios).</w:t>
-            </w:r>
-          </w:p>
-          <w:p>
-            <w:pPr>
-              <w:pStyle w:val="ListBullet"/>
-              <w:spacing w:after="40"/>
-            </w:pPr>
-            <w:r>
-              <w:rPr>
-                <w:sz w:val="19"/>
-              </w:rPr>
-              <w:t>Mostrar las carpetas de frontend: src/features, src/routes, src/store, src/shared.</w:t>
-            </w:r>
-          </w:p>
-        </w:tc>
-      </w:tr>
-    </w:tbl>
-    <w:p>
-      <w:pPr>
-        <w:spacing w:after="120"/>
-      </w:pPr>
-    </w:p>
-    <w:tbl>
-      <w:tblPr>
-        <w:tblW w:type="auto" w:w="0"/>
-        <w:jc w:val="center"/>
-        <w:tblLook w:firstColumn="1" w:firstRow="1" w:lastColumn="0" w:lastRow="0" w:noHBand="0" w:noVBand="1" w:val="04A0"/>
-      </w:tblPr>
-      <w:tblGrid>
-        <w:gridCol w:w="9360"/>
-      </w:tblGrid>
-      <w:tr>
-        <w:tc>
-          <w:tcPr>
-            <w:tcW w:type="dxa" w:w="9360"/>
-            <w:shd w:fill="FEF3C7"/>
-            <w:tcMar>
-              <w:top w:w="120" w:type="dxa"/>
-              <w:bottom w:w="120" w:type="dxa"/>
-              <w:left w:w="150" w:type="dxa"/>
-              <w:right w:w="150" w:type="dxa"/>
-            </w:tcMar>
-          </w:tcPr>
-          <w:p>
-            <w:pPr>
-              <w:spacing w:after="80"/>
             </w:pPr>
             <w:r>
               <w:rPr>
                 <w:b/>
                 <w:color w:val="B45309"/>
-                <w:sz w:val="20"/>
+                <w:sz w:val="19"/>
               </w:rPr>
-              <w:t>🎙️ QUÉ DECIR (GUION HABLADO):</w:t>
+              <w:t>🎙️ DECIR EN PARALELO (LO QUE DICES):</w:t>
             </w:r>
           </w:p>
           <w:p>
@@ -452,18 +396,9 @@
             <w:r>
               <w:rPr>
                 <w:i/>
-                <w:sz w:val="21"/>
+                <w:sz w:val="20"/>
               </w:rPr>
-              <w:t>"Buenas tardes a los profesores de la cátedra de Programación IV. Mi nombre es Brian Emanuel Rios y voy a presentar mi Trabajo Práctico Integrador: Food Store, una plataforma web para pedidos y delivery gastronómico.</w:t>
-              <w:br/>
-              <w:br/>
-              <w:t>Para este proyecto tomé como punto de partida el trabajo que realicé en Programación III, evolucionando su arquitectura hacia un estándar profesional desacoplado.</w:t>
-              <w:br/>
-              <w:br/>
-              <w:t>En el backend utilizamos Python 3.11 con FastAPI y SQLModel sobre SQLAlchemy 2. Implementamos una arquitectura limpia por capas: Router, Service, Unit of Work con context manager, repositorios genéricos y modelos de dominio. La autenticación se maneja con JWT firmado en cookies HttpOnly para evitar ataques XSS.</w:t>
-              <w:br/>
-              <w:br/>
-              <w:t>En el frontend construimos una Single Page Application con React 19 y TypeScript estricto, sin ningún tipo any, empaquetado con Vite 7 y Tailwind CSS 4. El estado del servidor lo gestionamos con TanStack Query 5, el estado del cliente con Zustand 5 persistente, y los formularios y tablas con TanStack Form 1 y TanStack Table 8."</w:t>
+              <w:t>"Buenas tardes a los profesores de la cátedra de Programación IV. Mi nombre es Brian Emanuel Rios y a continuación voy a presentar mi Trabajo Práctico Integrador: Food Store, una plataforma web para pedidos y delivery gastronómico en tiempo real."</w:t>
             </w:r>
           </w:p>
         </w:tc>
@@ -471,26 +406,27 @@
     </w:tbl>
     <w:p>
       <w:pPr>
-        <w:spacing w:after="240"/>
+        <w:spacing w:after="160"/>
       </w:pPr>
     </w:p>
     <w:p>
       <w:pPr>
-        <w:spacing w:before="320" w:after="80"/>
+        <w:spacing w:before="280" w:after="80"/>
       </w:pPr>
       <w:r>
         <w:rPr>
           <w:b/>
           <w:color w:val="92400E"/>
-          <w:sz w:val="26"/>
+          <w:sz w:val="24"/>
         </w:rPr>
-        <w:t>Bloque 2: Puesta en Marcha, Seed y Documentación Swagger (1:30 - 2:45)</w:t>
+        <w:t>Paso 2: Continuidad con Programación III</w:t>
       </w:r>
     </w:p>
     <w:tbl>
       <w:tblPr>
         <w:tblW w:type="auto" w:w="0"/>
         <w:jc w:val="center"/>
+        <w:tblLayout w:type="fixed"/>
         <w:tblLook w:firstColumn="1" w:firstRow="1" w:lastColumn="0" w:lastRow="0" w:noHBand="0" w:noVBand="1" w:val="04A0"/>
       </w:tblPr>
       <w:tblGrid>
@@ -502,6 +438,39 @@
             <w:tcW w:type="dxa" w:w="9360"/>
             <w:shd w:fill="EFF6FF"/>
             <w:tcMar>
+              <w:top w:w="80" w:type="dxa"/>
+              <w:bottom w:w="80" w:type="dxa"/>
+              <w:left w:w="120" w:type="dxa"/>
+              <w:right w:w="120" w:type="dxa"/>
+            </w:tcMar>
+          </w:tcPr>
+          <w:p>
+            <w:pPr>
+              <w:spacing w:after="40"/>
+            </w:pPr>
+            <w:r>
+              <w:rPr>
+                <w:b/>
+                <w:color w:val="1D4ED8"/>
+                <w:sz w:val="19"/>
+              </w:rPr>
+              <w:t xml:space="preserve">🖥️ EN PANTALLA (LO QUE HACES): </w:t>
+            </w:r>
+            <w:r>
+              <w:rPr>
+                <w:sz w:val="19"/>
+              </w:rPr>
+              <w:t>En el navegador, mostrá el logo de Food Store y el catálogo inicial.</w:t>
+            </w:r>
+          </w:p>
+        </w:tc>
+      </w:tr>
+      <w:tr>
+        <w:tc>
+          <w:tcPr>
+            <w:tcW w:type="dxa" w:w="9360"/>
+            <w:shd w:fill="FEF3C7"/>
+            <w:tcMar>
               <w:top w:w="100" w:type="dxa"/>
               <w:bottom w:w="100" w:type="dxa"/>
               <w:left w:w="140" w:type="dxa"/>
@@ -510,117 +479,15 @@
           </w:tcPr>
           <w:p>
             <w:pPr>
-              <w:spacing w:after="80"/>
-            </w:pPr>
-            <w:r>
-              <w:rPr>
-                <w:b/>
-                <w:color w:val="1D4ED8"/>
-                <w:sz w:val="20"/>
-              </w:rPr>
-              <w:t>🖥️ QUÉ MOSTRAR EN PANTALLA:</w:t>
-            </w:r>
-          </w:p>
-          <w:p>
-            <w:pPr>
-              <w:pStyle w:val="ListBullet"/>
               <w:spacing w:after="40"/>
-            </w:pPr>
-            <w:r>
-              <w:rPr>
-                <w:sz w:val="19"/>
-              </w:rPr>
-              <w:t>En la Terminal 1 (Backend), ejecutar: python -m app.db.seed.</w:t>
-            </w:r>
-          </w:p>
-          <w:p>
-            <w:pPr>
-              <w:pStyle w:val="ListBullet"/>
-              <w:spacing w:after="40"/>
-            </w:pPr>
-            <w:r>
-              <w:rPr>
-                <w:sz w:val="19"/>
-              </w:rPr>
-              <w:t>Mostrar el mensaje de creación de tablas, usuarios (admin/cliente) y catálogo sin duplicados.</w:t>
-            </w:r>
-          </w:p>
-          <w:p>
-            <w:pPr>
-              <w:pStyle w:val="ListBullet"/>
-              <w:spacing w:after="40"/>
-            </w:pPr>
-            <w:r>
-              <w:rPr>
-                <w:sz w:val="19"/>
-              </w:rPr>
-              <w:t>Iniciar FastAPI: uvicorn app.main:app --reload --port 8000.</w:t>
-            </w:r>
-          </w:p>
-          <w:p>
-            <w:pPr>
-              <w:pStyle w:val="ListBullet"/>
-              <w:spacing w:after="40"/>
-            </w:pPr>
-            <w:r>
-              <w:rPr>
-                <w:sz w:val="19"/>
-              </w:rPr>
-              <w:t>En el navegador abrir http://localhost:8000/docs y mostrar los endpoints organizados.</w:t>
-            </w:r>
-          </w:p>
-          <w:p>
-            <w:pPr>
-              <w:pStyle w:val="ListBullet"/>
-              <w:spacing w:after="40"/>
-            </w:pPr>
-            <w:r>
-              <w:rPr>
-                <w:sz w:val="19"/>
-              </w:rPr>
-              <w:t>En la Terminal 2 (Frontend), ejecutar pnpm build para demostrar 0 errores de TypeScript, y luego pnpm dev.</w:t>
-            </w:r>
-          </w:p>
-        </w:tc>
-      </w:tr>
-    </w:tbl>
-    <w:p>
-      <w:pPr>
-        <w:spacing w:after="120"/>
-      </w:pPr>
-    </w:p>
-    <w:tbl>
-      <w:tblPr>
-        <w:tblW w:type="auto" w:w="0"/>
-        <w:jc w:val="center"/>
-        <w:tblLook w:firstColumn="1" w:firstRow="1" w:lastColumn="0" w:lastRow="0" w:noHBand="0" w:noVBand="1" w:val="04A0"/>
-      </w:tblPr>
-      <w:tblGrid>
-        <w:gridCol w:w="9360"/>
-      </w:tblGrid>
-      <w:tr>
-        <w:tc>
-          <w:tcPr>
-            <w:tcW w:type="dxa" w:w="9360"/>
-            <w:shd w:fill="FEF3C7"/>
-            <w:tcMar>
-              <w:top w:w="120" w:type="dxa"/>
-              <w:bottom w:w="120" w:type="dxa"/>
-              <w:left w:w="150" w:type="dxa"/>
-              <w:right w:w="150" w:type="dxa"/>
-            </w:tcMar>
-          </w:tcPr>
-          <w:p>
-            <w:pPr>
-              <w:spacing w:after="80"/>
             </w:pPr>
             <w:r>
               <w:rPr>
                 <w:b/>
                 <w:color w:val="B45309"/>
-                <w:sz w:val="20"/>
+                <w:sz w:val="19"/>
               </w:rPr>
-              <w:t>🎙️ QUÉ DECIR (GUION HABLADO):</w:t>
+              <w:t>🎙️ DECIR EN PARALELO (LO QUE DICES):</w:t>
             </w:r>
           </w:p>
           <w:p>
@@ -630,15 +497,9 @@
             <w:r>
               <w:rPr>
                 <w:i/>
-                <w:sz w:val="21"/>
+                <w:sz w:val="20"/>
               </w:rPr>
-              <w:t>"Comenzamos mostrando la inicialización del sistema. En la consola del backend ejecutamos 'python -m app.db.seed'. Este script es completamente idempotente: verifica si los usuarios base o los productos ya existen y no genera duplicados, dejando la base lista para operar.</w:t>
-              <w:br/>
-              <w:br/>
-              <w:t>Iniciamos el servidor con Uvicorn en el puerto 8000 y vemos en el navegador la documentación interactiva Swagger UI. Aquí se observan los endpoints modulares de autenticación, catálogo, pedidos y administración.</w:t>
-              <w:br/>
-              <w:br/>
-              <w:t>En la terminal del frontend ejecutamos 'pnpm build' que corre 'tsc -b' y empaqueta con Vite. Como pueden comprobar, la compilación finaliza con código 0 y cero errores de tipado estricto. Ahora levantamos el entorno de desarrollo con 'pnpm dev'."</w:t>
+              <w:t>"Para este proyecto tomé como base la experiencia y el catálogo que había desarrollado en Programación III, evolucionando toda la solución hacia una arquitectura moderna, desacoplada y con estrictas reglas de negocio transaccionales."</w:t>
             </w:r>
           </w:p>
         </w:tc>
@@ -646,26 +507,27 @@
     </w:tbl>
     <w:p>
       <w:pPr>
-        <w:spacing w:after="240"/>
+        <w:spacing w:after="160"/>
       </w:pPr>
     </w:p>
     <w:p>
       <w:pPr>
-        <w:spacing w:before="320" w:after="80"/>
+        <w:spacing w:before="280" w:after="80"/>
       </w:pPr>
       <w:r>
         <w:rPr>
           <w:b/>
           <w:color w:val="92400E"/>
-          <w:sz w:val="26"/>
+          <w:sz w:val="24"/>
         </w:rPr>
-        <w:t>Bloque 3: Flujo del Cliente y Cumplimiento de Reglas de Negocio (2:45 - 5:30)</w:t>
+        <w:t>Paso 3: Estructura por Capas del Backend en VS Code</w:t>
       </w:r>
     </w:p>
     <w:tbl>
       <w:tblPr>
         <w:tblW w:type="auto" w:w="0"/>
         <w:jc w:val="center"/>
+        <w:tblLayout w:type="fixed"/>
         <w:tblLook w:firstColumn="1" w:firstRow="1" w:lastColumn="0" w:lastRow="0" w:noHBand="0" w:noVBand="1" w:val="04A0"/>
       </w:tblPr>
       <w:tblGrid>
@@ -677,6 +539,39 @@
             <w:tcW w:type="dxa" w:w="9360"/>
             <w:shd w:fill="EFF6FF"/>
             <w:tcMar>
+              <w:top w:w="80" w:type="dxa"/>
+              <w:bottom w:w="80" w:type="dxa"/>
+              <w:left w:w="120" w:type="dxa"/>
+              <w:right w:w="120" w:type="dxa"/>
+            </w:tcMar>
+          </w:tcPr>
+          <w:p>
+            <w:pPr>
+              <w:spacing w:after="40"/>
+            </w:pPr>
+            <w:r>
+              <w:rPr>
+                <w:b/>
+                <w:color w:val="1D4ED8"/>
+                <w:sz w:val="19"/>
+              </w:rPr>
+              <w:t xml:space="preserve">🖥️ EN PANTALLA (LO QUE HACES): </w:t>
+            </w:r>
+            <w:r>
+              <w:rPr>
+                <w:sz w:val="19"/>
+              </w:rPr>
+              <w:t>Abrí VS Code y desplegá la carpeta 'backend/app'. Mostrá 'core' (database, security, unit_of_work, base_repository) y 'modules' (auth, categorias, pedidos, productos, usuarios).</w:t>
+            </w:r>
+          </w:p>
+        </w:tc>
+      </w:tr>
+      <w:tr>
+        <w:tc>
+          <w:tcPr>
+            <w:tcW w:type="dxa" w:w="9360"/>
+            <w:shd w:fill="FEF3C7"/>
+            <w:tcMar>
               <w:top w:w="100" w:type="dxa"/>
               <w:bottom w:w="100" w:type="dxa"/>
               <w:left w:w="140" w:type="dxa"/>
@@ -685,153 +580,15 @@
           </w:tcPr>
           <w:p>
             <w:pPr>
-              <w:spacing w:after="80"/>
-            </w:pPr>
-            <w:r>
-              <w:rPr>
-                <w:b/>
-                <w:color w:val="1D4ED8"/>
-                <w:sz w:val="20"/>
-              </w:rPr>
-              <w:t>🖥️ QUÉ MOSTRAR EN PANTALLA:</w:t>
-            </w:r>
-          </w:p>
-          <w:p>
-            <w:pPr>
-              <w:pStyle w:val="ListBullet"/>
               <w:spacing w:after="40"/>
-            </w:pPr>
-            <w:r>
-              <w:rPr>
-                <w:sz w:val="19"/>
-              </w:rPr>
-              <w:t>Ir a http://localhost:5173 y hacer clic en 'Ingresar'.</w:t>
-            </w:r>
-          </w:p>
-          <w:p>
-            <w:pPr>
-              <w:pStyle w:val="ListBullet"/>
-              <w:spacing w:after="40"/>
-            </w:pPr>
-            <w:r>
-              <w:rPr>
-                <w:sz w:val="19"/>
-              </w:rPr>
-              <w:t>Mostrar la caja de credenciales demo y hacer clic en 'Cliente' (cliente / Cliente1234!).</w:t>
-            </w:r>
-          </w:p>
-          <w:p>
-            <w:pPr>
-              <w:pStyle w:val="ListBullet"/>
-              <w:spacing w:after="40"/>
-            </w:pPr>
-            <w:r>
-              <w:rPr>
-                <w:sz w:val="19"/>
-              </w:rPr>
-              <w:t>Iniciar sesión y mostrar el cartel flotante (Toast) de bienvenida.</w:t>
-            </w:r>
-          </w:p>
-          <w:p>
-            <w:pPr>
-              <w:pStyle w:val="ListBullet"/>
-              <w:spacing w:after="40"/>
-            </w:pPr>
-            <w:r>
-              <w:rPr>
-                <w:sz w:val="19"/>
-              </w:rPr>
-              <w:t>En el Catálogo: probar buscador por texto, filtro de categorías y paginación en servidor.</w:t>
-            </w:r>
-          </w:p>
-          <w:p>
-            <w:pPr>
-              <w:pStyle w:val="ListBullet"/>
-              <w:spacing w:after="40"/>
-            </w:pPr>
-            <w:r>
-              <w:rPr>
-                <w:sz w:val="19"/>
-              </w:rPr>
-              <w:t>Agregar 2 platos al carrito y mostrar cómo se abre el Mini Carrito Deslizable (CartDrawer).</w:t>
-            </w:r>
-          </w:p>
-          <w:p>
-            <w:pPr>
-              <w:pStyle w:val="ListBullet"/>
-              <w:spacing w:after="40"/>
-            </w:pPr>
-            <w:r>
-              <w:rPr>
-                <w:sz w:val="19"/>
-              </w:rPr>
-              <w:t>Ir a '/checkout': dejar la dirección con menos de 5 caracteres para ver la validación de TanStack Form (RN-06). Luego ingresar dirección válida, elegir Efectivo y confirmar.</w:t>
-            </w:r>
-          </w:p>
-          <w:p>
-            <w:pPr>
-              <w:pStyle w:val="ListBullet"/>
-              <w:spacing w:after="40"/>
-            </w:pPr>
-            <w:r>
-              <w:rPr>
-                <w:sz w:val="19"/>
-              </w:rPr>
-              <w:t>En '/mis-pedidos': mostrar la orden en estado PENDIENTE, desplegar el detalle con precios inmutables (RN-02).</w:t>
-            </w:r>
-          </w:p>
-          <w:p>
-            <w:pPr>
-              <w:pStyle w:val="ListBullet"/>
-              <w:spacing w:after="40"/>
-            </w:pPr>
-            <w:r>
-              <w:rPr>
-                <w:sz w:val="19"/>
-              </w:rPr>
-              <w:t>Hacer clic en 'Cancelar Pedido' (RN-05), confirmar en el modal y mostrar cómo el stock se restituye.</w:t>
-            </w:r>
-          </w:p>
-        </w:tc>
-      </w:tr>
-    </w:tbl>
-    <w:p>
-      <w:pPr>
-        <w:spacing w:after="120"/>
-      </w:pPr>
-    </w:p>
-    <w:tbl>
-      <w:tblPr>
-        <w:tblW w:type="auto" w:w="0"/>
-        <w:jc w:val="center"/>
-        <w:tblLook w:firstColumn="1" w:firstRow="1" w:lastColumn="0" w:lastRow="0" w:noHBand="0" w:noVBand="1" w:val="04A0"/>
-      </w:tblPr>
-      <w:tblGrid>
-        <w:gridCol w:w="9360"/>
-      </w:tblGrid>
-      <w:tr>
-        <w:tc>
-          <w:tcPr>
-            <w:tcW w:type="dxa" w:w="9360"/>
-            <w:shd w:fill="FEF3C7"/>
-            <w:tcMar>
-              <w:top w:w="120" w:type="dxa"/>
-              <w:bottom w:w="120" w:type="dxa"/>
-              <w:left w:w="150" w:type="dxa"/>
-              <w:right w:w="150" w:type="dxa"/>
-            </w:tcMar>
-          </w:tcPr>
-          <w:p>
-            <w:pPr>
-              <w:spacing w:after="80"/>
             </w:pPr>
             <w:r>
               <w:rPr>
                 <w:b/>
                 <w:color w:val="B45309"/>
-                <w:sz w:val="20"/>
+                <w:sz w:val="19"/>
               </w:rPr>
-              <w:t>🎙️ QUÉ DECIR (GUION HABLADO):</w:t>
+              <w:t>🎙️ DECIR EN PARALELO (LO QUE DICES):</w:t>
             </w:r>
           </w:p>
           <w:p>
@@ -841,21 +598,9 @@
             <w:r>
               <w:rPr>
                 <w:i/>
-                <w:sz w:val="21"/>
+                <w:sz w:val="20"/>
               </w:rPr>
-              <w:t>"Pasamos ahora a la experiencia del cliente. Entramos a la pantalla de login. Fíjense que implementamos TanStack Form con validaciones reactivas y mantuvimos la idea de Prog 3: un recuadro para autocompletar credenciales de prueba con un solo clic.</w:t>
-              <w:br/>
-              <w:br/>
-              <w:t>Ingresamos como Cliente. El backend establece la cookie HttpOnly y el sistema nos da la bienvenida con una notificación Toast flotante.</w:t>
-              <w:br/>
-              <w:br/>
-              <w:t>En el catálogo tenemos paginación en servidor mediante skip y limit. Filtramos por categorías y buscamos por texto. Al presionar 'Agregar', se despliega el Mini Carrito Deslizable lateral, permitiendo modificar unidades en vivo respetando el stock disponible.</w:t>
-              <w:br/>
-              <w:br/>
-              <w:t>Avanzamos al Checkout. Si la dirección tiene menos de 5 caracteres, TanStack Form nos alerta cumpliendo la regla RN-06. Ingresamos una dirección completa, elegimos pago en Efectivo y confirmamos.</w:t>
-              <w:br/>
-              <w:br/>
-              <w:t>El backend procesa la orden de forma atómica con Unit of Work (regla RN-01), descuenta el stock, vacía el carrito y nos lleva a 'Mis Pedidos'. Aquí vemos la orden en estado PENDIENTE con su foto histórica de precios unitarios inmutables (RN-02). Al presionar 'Cancelar Pedido', se ejecuta la regla RN-05: se valida que la orden esté pendiente, se anula y las cantidades se reintegran al inventario."</w:t>
+              <w:t>"En el backend implementamos una arquitectura limpia por capas con Python 3.11, FastAPI y SQLModel sobre SQLAlchemy 2: Router, Service, Unit of Work y Repository. La seguridad se basa en tokens JWT firmados almacenados en cookies HttpOnly para prevenir vulnerabilidades XSS."</w:t>
             </w:r>
           </w:p>
         </w:tc>
@@ -863,26 +608,27 @@
     </w:tbl>
     <w:p>
       <w:pPr>
-        <w:spacing w:after="240"/>
+        <w:spacing w:after="160"/>
       </w:pPr>
     </w:p>
     <w:p>
       <w:pPr>
-        <w:spacing w:before="320" w:after="80"/>
+        <w:spacing w:before="280" w:after="80"/>
       </w:pPr>
       <w:r>
         <w:rPr>
           <w:b/>
           <w:color w:val="92400E"/>
-          <w:sz w:val="26"/>
+          <w:sz w:val="24"/>
         </w:rPr>
-        <w:t>Bloque 4: Flujo del Administrador, Métricas y Máquina de Estados (5:30 - 8:00)</w:t>
+        <w:t>Paso 4: Estructura del Frontend en VS Code</w:t>
       </w:r>
     </w:p>
     <w:tbl>
       <w:tblPr>
         <w:tblW w:type="auto" w:w="0"/>
         <w:jc w:val="center"/>
+        <w:tblLayout w:type="fixed"/>
         <w:tblLook w:firstColumn="1" w:firstRow="1" w:lastColumn="0" w:lastRow="0" w:noHBand="0" w:noVBand="1" w:val="04A0"/>
       </w:tblPr>
       <w:tblGrid>
@@ -894,6 +640,39 @@
             <w:tcW w:type="dxa" w:w="9360"/>
             <w:shd w:fill="EFF6FF"/>
             <w:tcMar>
+              <w:top w:w="80" w:type="dxa"/>
+              <w:bottom w:w="80" w:type="dxa"/>
+              <w:left w:w="120" w:type="dxa"/>
+              <w:right w:w="120" w:type="dxa"/>
+            </w:tcMar>
+          </w:tcPr>
+          <w:p>
+            <w:pPr>
+              <w:spacing w:after="40"/>
+            </w:pPr>
+            <w:r>
+              <w:rPr>
+                <w:b/>
+                <w:color w:val="1D4ED8"/>
+                <w:sz w:val="19"/>
+              </w:rPr>
+              <w:t xml:space="preserve">🖥️ EN PANTALLA (LO QUE HACES): </w:t>
+            </w:r>
+            <w:r>
+              <w:rPr>
+                <w:sz w:val="19"/>
+              </w:rPr>
+              <w:t>En VS Code, desplegá 'frontend/src'. Mostrá 'features' por dominio, 'routes' con ProtectedRoute, 'store' (authStore, cartStore) y 'shared'.</w:t>
+            </w:r>
+          </w:p>
+        </w:tc>
+      </w:tr>
+      <w:tr>
+        <w:tc>
+          <w:tcPr>
+            <w:tcW w:type="dxa" w:w="9360"/>
+            <w:shd w:fill="FEF3C7"/>
+            <w:tcMar>
               <w:top w:w="100" w:type="dxa"/>
               <w:bottom w:w="100" w:type="dxa"/>
               <w:left w:w="140" w:type="dxa"/>
@@ -902,129 +681,15 @@
           </w:tcPr>
           <w:p>
             <w:pPr>
-              <w:spacing w:after="80"/>
-            </w:pPr>
-            <w:r>
-              <w:rPr>
-                <w:b/>
-                <w:color w:val="1D4ED8"/>
-                <w:sz w:val="20"/>
-              </w:rPr>
-              <w:t>🖥️ QUÉ MOSTRAR EN PANTALLA:</w:t>
-            </w:r>
-          </w:p>
-          <w:p>
-            <w:pPr>
-              <w:pStyle w:val="ListBullet"/>
               <w:spacing w:after="40"/>
-            </w:pPr>
-            <w:r>
-              <w:rPr>
-                <w:sz w:val="19"/>
-              </w:rPr>
-              <w:t>Cerrar sesión del cliente y entrar con la cuenta de 'Admin' (admin / Admin1234!).</w:t>
-            </w:r>
-          </w:p>
-          <w:p>
-            <w:pPr>
-              <w:pStyle w:val="ListBullet"/>
-              <w:spacing w:after="40"/>
-            </w:pPr>
-            <w:r>
-              <w:rPr>
-                <w:sz w:val="19"/>
-              </w:rPr>
-              <w:t>Pestaña Resumen (/admin/resumen): Mostrar los 6 KPIs (Ingresos entregados, pedidos de hoy, en preparación, pendientes, entregados, cancelados).</w:t>
-            </w:r>
-          </w:p>
-          <w:p>
-            <w:pPr>
-              <w:pStyle w:val="ListBullet"/>
-              <w:spacing w:after="40"/>
-            </w:pPr>
-            <w:r>
-              <w:rPr>
-                <w:sz w:val="19"/>
-              </w:rPr>
-              <w:t>Pestaña Pedidos (/admin/pedidos): Filtrar pedidos. Tomar un pedido PENDIENTE y hacer clic en 'Preparar' (pasa a EN_PREPARACION). Luego en 'Marcar Entregado' (RN-03).</w:t>
-            </w:r>
-          </w:p>
-          <w:p>
-            <w:pPr>
-              <w:pStyle w:val="ListBullet"/>
-              <w:spacing w:after="40"/>
-            </w:pPr>
-            <w:r>
-              <w:rPr>
-                <w:sz w:val="19"/>
-              </w:rPr>
-              <w:t>Pestaña Categorías (/admin/categorias): Mostrar la tabla con TanStack Table (filtro y paginación en cliente). Crear una categoría con el modal TanStack Form.</w:t>
-            </w:r>
-          </w:p>
-          <w:p>
-            <w:pPr>
-              <w:pStyle w:val="ListBullet"/>
-              <w:spacing w:after="40"/>
-            </w:pPr>
-            <w:r>
-              <w:rPr>
-                <w:sz w:val="19"/>
-              </w:rPr>
-              <w:t>Pestaña Productos (/admin/productos): Mostrar ajuste rápido de stock inline (+ y -) y switch de disponibilidad con un clic.</w:t>
-            </w:r>
-          </w:p>
-          <w:p>
-            <w:pPr>
-              <w:pStyle w:val="ListBullet"/>
-              <w:spacing w:after="40"/>
-            </w:pPr>
-            <w:r>
-              <w:rPr>
-                <w:sz w:val="19"/>
-              </w:rPr>
-              <w:t>Pestaña Usuarios (/admin/usuarios): Mostrar la lista y señalar que el botón Desactivar para el admin actual está bloqueado ('Protegido').</w:t>
-            </w:r>
-          </w:p>
-        </w:tc>
-      </w:tr>
-    </w:tbl>
-    <w:p>
-      <w:pPr>
-        <w:spacing w:after="120"/>
-      </w:pPr>
-    </w:p>
-    <w:tbl>
-      <w:tblPr>
-        <w:tblW w:type="auto" w:w="0"/>
-        <w:jc w:val="center"/>
-        <w:tblLook w:firstColumn="1" w:firstRow="1" w:lastColumn="0" w:lastRow="0" w:noHBand="0" w:noVBand="1" w:val="04A0"/>
-      </w:tblPr>
-      <w:tblGrid>
-        <w:gridCol w:w="9360"/>
-      </w:tblGrid>
-      <w:tr>
-        <w:tc>
-          <w:tcPr>
-            <w:tcW w:type="dxa" w:w="9360"/>
-            <w:shd w:fill="FEF3C7"/>
-            <w:tcMar>
-              <w:top w:w="120" w:type="dxa"/>
-              <w:bottom w:w="120" w:type="dxa"/>
-              <w:left w:w="150" w:type="dxa"/>
-              <w:right w:w="150" w:type="dxa"/>
-            </w:tcMar>
-          </w:tcPr>
-          <w:p>
-            <w:pPr>
-              <w:spacing w:after="80"/>
             </w:pPr>
             <w:r>
               <w:rPr>
                 <w:b/>
                 <w:color w:val="B45309"/>
-                <w:sz w:val="20"/>
+                <w:sz w:val="19"/>
               </w:rPr>
-              <w:t>🎙️ QUÉ DECIR (GUION HABLADO):</w:t>
+              <w:t>🎙️ DECIR EN PARALELO (LO QUE DICES):</w:t>
             </w:r>
           </w:p>
           <w:p>
@@ -1034,21 +699,9 @@
             <w:r>
               <w:rPr>
                 <w:i/>
-                <w:sz w:val="21"/>
+                <w:sz w:val="20"/>
               </w:rPr>
-              <w:t>"Cerramos sesión e ingresamos ahora con el usuario Administrador. El guardián de rutas nos dirige directamente al Panel de Control.</w:t>
-              <w:br/>
-              <w:br/>
-              <w:t>En 'Resumen' observamos las métricas en tiempo real: facturación total de órdenes entregadas, pedidos del día y estado de cocina.</w:t>
-              <w:br/>
-              <w:br/>
-              <w:t>En la pestaña 'Pedidos' se aplica la regla RN-03: la máquina de estados. Si una orden está PENDIENTE, el administrador puede pasarla a EN_PREPARACION o cancelarla. Estando en preparación, puede marcarla como ENTREGADO. Una vez entregada o cancelada, la orden entra en estado final y no admite más transiciones.</w:t>
-              <w:br/>
-              <w:br/>
-              <w:t>En 'Categorías' y 'Productos' implementamos TanStack Table para filtrado y ordenamiento en cliente. Podemos dar de alta platos con TanStack Form y utilizar la edición rápida de stock inline con los botones de más y menos, o pausar la disponibilidad de un plato para que no figure en el catálogo.</w:t>
-              <w:br/>
-              <w:br/>
-              <w:t>Finalmente, en 'Usuarios', administramos las cuentas. Observen la regla de seguridad: el sistema bloquea la auto-desactivación del administrador logueado, garantizando que el panel nunca quede inaccesible."</w:t>
+              <w:t>"En el frontend desarrollamos una Single Page Application con React 19 y TypeScript estricto sin ningún tipo any, empaquetada con Vite 7 y Tailwind CSS 4. Para el estado del servidor usamos TanStack Query 5, para el estado del cliente Zustand 5 persistente, y para formularios y tablas TanStack Form 1 y TanStack Table 8."</w:t>
             </w:r>
           </w:p>
         </w:tc>
@@ -1056,26 +709,27 @@
     </w:tbl>
     <w:p>
       <w:pPr>
-        <w:spacing w:after="240"/>
+        <w:spacing w:after="160"/>
       </w:pPr>
     </w:p>
     <w:p>
       <w:pPr>
-        <w:spacing w:before="320" w:after="80"/>
+        <w:spacing w:before="280" w:after="80"/>
       </w:pPr>
       <w:r>
         <w:rPr>
           <w:b/>
           <w:color w:val="92400E"/>
-          <w:sz w:val="26"/>
+          <w:sz w:val="24"/>
         </w:rPr>
-        <w:t>Bloque 5: Puntos Fuertes del Código, Empaquetado y Cierre (8:00 - 9:00)</w:t>
+        <w:t>Paso 5: Carga Semilla Idempotente (Seed)</w:t>
       </w:r>
     </w:p>
     <w:tbl>
       <w:tblPr>
         <w:tblW w:type="auto" w:w="0"/>
         <w:jc w:val="center"/>
+        <w:tblLayout w:type="fixed"/>
         <w:tblLook w:firstColumn="1" w:firstRow="1" w:lastColumn="0" w:lastRow="0" w:noHBand="0" w:noVBand="1" w:val="04A0"/>
       </w:tblPr>
       <w:tblGrid>
@@ -1087,6 +741,39 @@
             <w:tcW w:type="dxa" w:w="9360"/>
             <w:shd w:fill="EFF6FF"/>
             <w:tcMar>
+              <w:top w:w="80" w:type="dxa"/>
+              <w:bottom w:w="80" w:type="dxa"/>
+              <w:left w:w="120" w:type="dxa"/>
+              <w:right w:w="120" w:type="dxa"/>
+            </w:tcMar>
+          </w:tcPr>
+          <w:p>
+            <w:pPr>
+              <w:spacing w:after="40"/>
+            </w:pPr>
+            <w:r>
+              <w:rPr>
+                <w:b/>
+                <w:color w:val="1D4ED8"/>
+                <w:sz w:val="19"/>
+              </w:rPr>
+              <w:t xml:space="preserve">🖥️ EN PANTALLA (LO QUE HACES): </w:t>
+            </w:r>
+            <w:r>
+              <w:rPr>
+                <w:sz w:val="19"/>
+              </w:rPr>
+              <w:t>Cambiá a la Terminal 1 (backend) y ejecutá: python -m app.db.seed. Mostrá en la consola los mensajes de tablas creadas y usuarios admin/cliente listos.</w:t>
+            </w:r>
+          </w:p>
+        </w:tc>
+      </w:tr>
+      <w:tr>
+        <w:tc>
+          <w:tcPr>
+            <w:tcW w:type="dxa" w:w="9360"/>
+            <w:shd w:fill="FEF3C7"/>
+            <w:tcMar>
               <w:top w:w="100" w:type="dxa"/>
               <w:bottom w:w="100" w:type="dxa"/>
               <w:left w:w="140" w:type="dxa"/>
@@ -1095,75 +782,27 @@
           </w:tcPr>
           <w:p>
             <w:pPr>
-              <w:spacing w:after="80"/>
+              <w:spacing w:after="40"/>
             </w:pPr>
             <w:r>
               <w:rPr>
                 <w:b/>
-                <w:color w:val="1D4ED8"/>
-                <w:sz w:val="20"/>
+                <w:color w:val="B45309"/>
+                <w:sz w:val="19"/>
               </w:rPr>
-              <w:t>🖥️ QUÉ MOSTRAR EN PANTALLA:</w:t>
+              <w:t>🎙️ DECIR EN PARALELO (LO QUE DICES):</w:t>
             </w:r>
           </w:p>
           <w:p>
             <w:pPr>
-              <w:pStyle w:val="ListBullet"/>
-              <w:spacing w:after="40"/>
+              <w:spacing w:after="0" w:line="276" w:lineRule="auto"/>
             </w:pPr>
             <w:r>
               <w:rPr>
-                <w:sz w:val="19"/>
+                <w:i/>
+                <w:sz w:val="20"/>
               </w:rPr>
-              <w:t>En VS Code: mostrar rápidamente unit_of_work.py (context manager, commit y rollback automático).</w:t>
-            </w:r>
-          </w:p>
-          <w:p>
-            <w:pPr>
-              <w:pStyle w:val="ListBullet"/>
-              <w:spacing w:after="40"/>
-            </w:pPr>
-            <w:r>
-              <w:rPr>
-                <w:sz w:val="19"/>
-              </w:rPr>
-              <w:t>Mostrar frontend/src/store/authStore.ts (partialize guardando solo el usuario, sin tokens en localStorage).</w:t>
-            </w:r>
-          </w:p>
-          <w:p>
-            <w:pPr>
-              <w:pStyle w:val="ListBullet"/>
-              <w:spacing w:after="40"/>
-            </w:pPr>
-            <w:r>
-              <w:rPr>
-                <w:sz w:val="19"/>
-              </w:rPr>
-              <w:t>En la terminal, ejecutar: powershell -ExecutionPolicy Bypass -File scripts/empaquetar_entrega.ps1.</w:t>
-            </w:r>
-          </w:p>
-          <w:p>
-            <w:pPr>
-              <w:pStyle w:val="ListBullet"/>
-              <w:spacing w:after="40"/>
-            </w:pPr>
-            <w:r>
-              <w:rPr>
-                <w:sz w:val="19"/>
-              </w:rPr>
-              <w:t>Mostrar el archivo TPI-Food_Store-Brian_Emanuel_Rios.zip generado de 0.88 MB.</w:t>
-            </w:r>
-          </w:p>
-          <w:p>
-            <w:pPr>
-              <w:pStyle w:val="ListBullet"/>
-              <w:spacing w:after="40"/>
-            </w:pPr>
-            <w:r>
-              <w:rPr>
-                <w:sz w:val="19"/>
-              </w:rPr>
-              <w:t>Mostrar el repositorio GitHub con los 11 issues cerrados.</w:t>
+              <w:t>"Comenzamos mostrando la inicialización del sistema. En la consola del backend ejecutamos 'python -m app.db.seed'. Este proceso es 100% idempotente: si las tablas o los usuarios ya existen, no duplica registros, asegurando que la base de datos quede lista con un administrador, un cliente y los productos de la tienda."</w:t>
             </w:r>
           </w:p>
         </w:tc>
@@ -1171,13 +810,27 @@
     </w:tbl>
     <w:p>
       <w:pPr>
-        <w:spacing w:after="120"/>
+        <w:spacing w:after="160"/>
       </w:pPr>
+    </w:p>
+    <w:p>
+      <w:pPr>
+        <w:spacing w:before="280" w:after="80"/>
+      </w:pPr>
+      <w:r>
+        <w:rPr>
+          <w:b/>
+          <w:color w:val="92400E"/>
+          <w:sz w:val="24"/>
+        </w:rPr>
+        <w:t>Paso 6: Inicio del Backend y Documentación Swagger</w:t>
+      </w:r>
     </w:p>
     <w:tbl>
       <w:tblPr>
         <w:tblW w:type="auto" w:w="0"/>
         <w:jc w:val="center"/>
+        <w:tblLayout w:type="fixed"/>
         <w:tblLook w:firstColumn="1" w:firstRow="1" w:lastColumn="0" w:lastRow="0" w:noHBand="0" w:noVBand="1" w:val="04A0"/>
       </w:tblPr>
       <w:tblGrid>
@@ -1187,25 +840,58 @@
         <w:tc>
           <w:tcPr>
             <w:tcW w:type="dxa" w:w="9360"/>
-            <w:shd w:fill="FEF3C7"/>
+            <w:shd w:fill="EFF6FF"/>
             <w:tcMar>
-              <w:top w:w="120" w:type="dxa"/>
-              <w:bottom w:w="120" w:type="dxa"/>
-              <w:left w:w="150" w:type="dxa"/>
-              <w:right w:w="150" w:type="dxa"/>
+              <w:top w:w="80" w:type="dxa"/>
+              <w:bottom w:w="80" w:type="dxa"/>
+              <w:left w:w="120" w:type="dxa"/>
+              <w:right w:w="120" w:type="dxa"/>
             </w:tcMar>
           </w:tcPr>
           <w:p>
             <w:pPr>
-              <w:spacing w:after="80"/>
+              <w:spacing w:after="40"/>
+            </w:pPr>
+            <w:r>
+              <w:rPr>
+                <w:b/>
+                <w:color w:val="1D4ED8"/>
+                <w:sz w:val="19"/>
+              </w:rPr>
+              <w:t xml:space="preserve">🖥️ EN PANTALLA (LO QUE HACES): </w:t>
+            </w:r>
+            <w:r>
+              <w:rPr>
+                <w:sz w:val="19"/>
+              </w:rPr>
+              <w:t>En la misma Terminal 1, ejecutá: uvicorn app.main:app --reload --port 8000. Luego cambiá al navegador a http://localhost:8000/docs y desplazate por los routers.</w:t>
+            </w:r>
+          </w:p>
+        </w:tc>
+      </w:tr>
+      <w:tr>
+        <w:tc>
+          <w:tcPr>
+            <w:tcW w:type="dxa" w:w="9360"/>
+            <w:shd w:fill="FEF3C7"/>
+            <w:tcMar>
+              <w:top w:w="100" w:type="dxa"/>
+              <w:bottom w:w="100" w:type="dxa"/>
+              <w:left w:w="140" w:type="dxa"/>
+              <w:right w:w="140" w:type="dxa"/>
+            </w:tcMar>
+          </w:tcPr>
+          <w:p>
+            <w:pPr>
+              <w:spacing w:after="40"/>
             </w:pPr>
             <w:r>
               <w:rPr>
                 <w:b/>
                 <w:color w:val="B45309"/>
-                <w:sz w:val="20"/>
+                <w:sz w:val="19"/>
               </w:rPr>
-              <w:t>🎙️ QUÉ DECIR (GUION HABLADO):</w:t>
+              <w:t>🎙️ DECIR EN PARALELO (LO QUE DICES):</w:t>
             </w:r>
           </w:p>
           <w:p>
@@ -1215,22 +901,9 @@
             <w:r>
               <w:rPr>
                 <w:i/>
-                <w:sz w:val="21"/>
+                <w:sz w:val="20"/>
               </w:rPr>
-              <w:t>"Para finalizar, repasamos dos aspectos fundamentales del código:</w:t>
-              <w:br/>
-              <w:t>En 'unit_of_work.py' definimos el context manager con __enter__ y __exit__. Ante cualquier falla o excepción, se ejecuta automáticamente un rollback garantizando atomicidad.</w:t>
-              <w:br/>
-              <w:t>En el frontend, 'authStore.ts' persiste únicamente el objeto usuario mediante partialize. La cookie HttpOnly viaja automáticamente con withCredentials, manteniendo el token fuera del alcance de JavaScript.</w:t>
-              <w:br/>
-              <w:br/>
-              <w:t>Por último, ejecutamos el script 'empaquetar_entrega.ps1', que comprime la solución en un archivo ZIP limpio de 0.88 MB, excluyendo node_modules, entornos virtuales y secretos locales, listo para el campus virtual.</w:t>
-              <w:br/>
-              <w:br/>
-              <w:t>Todos los cambios fueron sincronizados en GitHub siguiendo Conventional Commits y cerrando los 11 issues correspondientes a los criterios de evaluación.</w:t>
-              <w:br/>
-              <w:br/>
-              <w:t>Muchas gracias por su atención."</w:t>
+              <w:t>"Iniciamos FastAPI con Uvicorn en el puerto 8000. En el navegador vemos la documentación interactiva en Swagger UI, donde se encuentran todos los endpoints modulares: autenticación, catálogo, pedidos y panel de administración."</w:t>
             </w:r>
           </w:p>
         </w:tc>
@@ -1238,7 +911,1724 @@
     </w:tbl>
     <w:p>
       <w:pPr>
-        <w:spacing w:after="240"/>
+        <w:spacing w:after="160"/>
+      </w:pPr>
+    </w:p>
+    <w:p>
+      <w:pPr>
+        <w:spacing w:before="280" w:after="80"/>
+      </w:pPr>
+      <w:r>
+        <w:rPr>
+          <w:b/>
+          <w:color w:val="92400E"/>
+          <w:sz w:val="24"/>
+        </w:rPr>
+        <w:t>Paso 7: Verificación de Tipos Estrictos y Arranque del Frontend</w:t>
+      </w:r>
+    </w:p>
+    <w:tbl>
+      <w:tblPr>
+        <w:tblW w:type="auto" w:w="0"/>
+        <w:jc w:val="center"/>
+        <w:tblLayout w:type="fixed"/>
+        <w:tblLook w:firstColumn="1" w:firstRow="1" w:lastColumn="0" w:lastRow="0" w:noHBand="0" w:noVBand="1" w:val="04A0"/>
+      </w:tblPr>
+      <w:tblGrid>
+        <w:gridCol w:w="9360"/>
+      </w:tblGrid>
+      <w:tr>
+        <w:tc>
+          <w:tcPr>
+            <w:tcW w:type="dxa" w:w="9360"/>
+            <w:shd w:fill="EFF6FF"/>
+            <w:tcMar>
+              <w:top w:w="80" w:type="dxa"/>
+              <w:bottom w:w="80" w:type="dxa"/>
+              <w:left w:w="120" w:type="dxa"/>
+              <w:right w:w="120" w:type="dxa"/>
+            </w:tcMar>
+          </w:tcPr>
+          <w:p>
+            <w:pPr>
+              <w:spacing w:after="40"/>
+            </w:pPr>
+            <w:r>
+              <w:rPr>
+                <w:b/>
+                <w:color w:val="1D4ED8"/>
+                <w:sz w:val="19"/>
+              </w:rPr>
+              <w:t xml:space="preserve">🖥️ EN PANTALLA (LO QUE HACES): </w:t>
+            </w:r>
+            <w:r>
+              <w:rPr>
+                <w:sz w:val="19"/>
+              </w:rPr>
+              <w:t>Cambiá a la Terminal 2 (frontend) y ejecutá: pnpm build. Mostrá que finaliza con código 0 sin errores de TypeScript. Luego ejecutá: pnpm dev.</w:t>
+            </w:r>
+          </w:p>
+        </w:tc>
+      </w:tr>
+      <w:tr>
+        <w:tc>
+          <w:tcPr>
+            <w:tcW w:type="dxa" w:w="9360"/>
+            <w:shd w:fill="FEF3C7"/>
+            <w:tcMar>
+              <w:top w:w="100" w:type="dxa"/>
+              <w:bottom w:w="100" w:type="dxa"/>
+              <w:left w:w="140" w:type="dxa"/>
+              <w:right w:w="140" w:type="dxa"/>
+            </w:tcMar>
+          </w:tcPr>
+          <w:p>
+            <w:pPr>
+              <w:spacing w:after="40"/>
+            </w:pPr>
+            <w:r>
+              <w:rPr>
+                <w:b/>
+                <w:color w:val="B45309"/>
+                <w:sz w:val="19"/>
+              </w:rPr>
+              <w:t>🎙️ DECIR EN PARALELO (LO QUE DICES):</w:t>
+            </w:r>
+          </w:p>
+          <w:p>
+            <w:pPr>
+              <w:spacing w:after="0" w:line="276" w:lineRule="auto"/>
+            </w:pPr>
+            <w:r>
+              <w:rPr>
+                <w:i/>
+                <w:sz w:val="20"/>
+              </w:rPr>
+              <w:t>"En la terminal del frontend corremos 'pnpm build', que ejecuta el compilador estricto de TypeScript. Como pueden comprobar, la compilación de producción termina con código de salida 0 y cero errores de tipos. Ahora iniciamos el servidor de desarrollo de Vite con 'pnpm dev'."</w:t>
+            </w:r>
+          </w:p>
+        </w:tc>
+      </w:tr>
+    </w:tbl>
+    <w:p>
+      <w:pPr>
+        <w:spacing w:after="160"/>
+      </w:pPr>
+    </w:p>
+    <w:p>
+      <w:pPr>
+        <w:spacing w:before="280" w:after="80"/>
+      </w:pPr>
+      <w:r>
+        <w:rPr>
+          <w:b/>
+          <w:color w:val="92400E"/>
+          <w:sz w:val="24"/>
+        </w:rPr>
+        <w:t>Paso 8: Pantalla de Login y Credenciales Demo</w:t>
+      </w:r>
+    </w:p>
+    <w:tbl>
+      <w:tblPr>
+        <w:tblW w:type="auto" w:w="0"/>
+        <w:jc w:val="center"/>
+        <w:tblLayout w:type="fixed"/>
+        <w:tblLook w:firstColumn="1" w:firstRow="1" w:lastColumn="0" w:lastRow="0" w:noHBand="0" w:noVBand="1" w:val="04A0"/>
+      </w:tblPr>
+      <w:tblGrid>
+        <w:gridCol w:w="9360"/>
+      </w:tblGrid>
+      <w:tr>
+        <w:tc>
+          <w:tcPr>
+            <w:tcW w:type="dxa" w:w="9360"/>
+            <w:shd w:fill="EFF6FF"/>
+            <w:tcMar>
+              <w:top w:w="80" w:type="dxa"/>
+              <w:bottom w:w="80" w:type="dxa"/>
+              <w:left w:w="120" w:type="dxa"/>
+              <w:right w:w="120" w:type="dxa"/>
+            </w:tcMar>
+          </w:tcPr>
+          <w:p>
+            <w:pPr>
+              <w:spacing w:after="40"/>
+            </w:pPr>
+            <w:r>
+              <w:rPr>
+                <w:b/>
+                <w:color w:val="1D4ED8"/>
+                <w:sz w:val="19"/>
+              </w:rPr>
+              <w:t xml:space="preserve">🖥️ EN PANTALLA (LO QUE HACES): </w:t>
+            </w:r>
+            <w:r>
+              <w:rPr>
+                <w:sz w:val="19"/>
+              </w:rPr>
+              <w:t>En el navegador andá a http://localhost:5173 y hacé clic en 'Ingresar'. Mostrá el formulario y hacé clic en el botón demo 'Cliente (cliente / Cliente1234!)'.</w:t>
+            </w:r>
+          </w:p>
+        </w:tc>
+      </w:tr>
+      <w:tr>
+        <w:tc>
+          <w:tcPr>
+            <w:tcW w:type="dxa" w:w="9360"/>
+            <w:shd w:fill="FEF3C7"/>
+            <w:tcMar>
+              <w:top w:w="100" w:type="dxa"/>
+              <w:bottom w:w="100" w:type="dxa"/>
+              <w:left w:w="140" w:type="dxa"/>
+              <w:right w:w="140" w:type="dxa"/>
+            </w:tcMar>
+          </w:tcPr>
+          <w:p>
+            <w:pPr>
+              <w:spacing w:after="40"/>
+            </w:pPr>
+            <w:r>
+              <w:rPr>
+                <w:b/>
+                <w:color w:val="B45309"/>
+                <w:sz w:val="19"/>
+              </w:rPr>
+              <w:t>🎙️ DECIR EN PARALELO (LO QUE DICES):</w:t>
+            </w:r>
+          </w:p>
+          <w:p>
+            <w:pPr>
+              <w:spacing w:after="0" w:line="276" w:lineRule="auto"/>
+            </w:pPr>
+            <w:r>
+              <w:rPr>
+                <w:i/>
+                <w:sz w:val="20"/>
+              </w:rPr>
+              <w:t>"Ingresamos a la tienda. En la pantalla de login implementamos TanStack Form para validaciones reactivas, y sumamos una idea que tenía en Prog 3: botones de credenciales rápidas. Hacemos clic en 'Cliente' y los campos se autorrellenan al instante."</w:t>
+            </w:r>
+          </w:p>
+        </w:tc>
+      </w:tr>
+    </w:tbl>
+    <w:p>
+      <w:pPr>
+        <w:spacing w:after="160"/>
+      </w:pPr>
+    </w:p>
+    <w:p>
+      <w:pPr>
+        <w:spacing w:before="280" w:after="80"/>
+      </w:pPr>
+      <w:r>
+        <w:rPr>
+          <w:b/>
+          <w:color w:val="92400E"/>
+          <w:sz w:val="24"/>
+        </w:rPr>
+        <w:t>Paso 9: Inicio de Sesión y Toast de Bienvenida</w:t>
+      </w:r>
+    </w:p>
+    <w:tbl>
+      <w:tblPr>
+        <w:tblW w:type="auto" w:w="0"/>
+        <w:jc w:val="center"/>
+        <w:tblLayout w:type="fixed"/>
+        <w:tblLook w:firstColumn="1" w:firstRow="1" w:lastColumn="0" w:lastRow="0" w:noHBand="0" w:noVBand="1" w:val="04A0"/>
+      </w:tblPr>
+      <w:tblGrid>
+        <w:gridCol w:w="9360"/>
+      </w:tblGrid>
+      <w:tr>
+        <w:tc>
+          <w:tcPr>
+            <w:tcW w:type="dxa" w:w="9360"/>
+            <w:shd w:fill="EFF6FF"/>
+            <w:tcMar>
+              <w:top w:w="80" w:type="dxa"/>
+              <w:bottom w:w="80" w:type="dxa"/>
+              <w:left w:w="120" w:type="dxa"/>
+              <w:right w:w="120" w:type="dxa"/>
+            </w:tcMar>
+          </w:tcPr>
+          <w:p>
+            <w:pPr>
+              <w:spacing w:after="40"/>
+            </w:pPr>
+            <w:r>
+              <w:rPr>
+                <w:b/>
+                <w:color w:val="1D4ED8"/>
+                <w:sz w:val="19"/>
+              </w:rPr>
+              <w:t xml:space="preserve">🖥️ EN PANTALLA (LO QUE HACES): </w:t>
+            </w:r>
+            <w:r>
+              <w:rPr>
+                <w:sz w:val="19"/>
+              </w:rPr>
+              <w:t>Hacé clic en el botón 'Iniciar Sesión'. Mostrá el Toast flotante verde arriba a la derecha y el Navbar con el nombre del cliente.</w:t>
+            </w:r>
+          </w:p>
+        </w:tc>
+      </w:tr>
+      <w:tr>
+        <w:tc>
+          <w:tcPr>
+            <w:tcW w:type="dxa" w:w="9360"/>
+            <w:shd w:fill="FEF3C7"/>
+            <w:tcMar>
+              <w:top w:w="100" w:type="dxa"/>
+              <w:bottom w:w="100" w:type="dxa"/>
+              <w:left w:w="140" w:type="dxa"/>
+              <w:right w:w="140" w:type="dxa"/>
+            </w:tcMar>
+          </w:tcPr>
+          <w:p>
+            <w:pPr>
+              <w:spacing w:after="40"/>
+            </w:pPr>
+            <w:r>
+              <w:rPr>
+                <w:b/>
+                <w:color w:val="B45309"/>
+                <w:sz w:val="19"/>
+              </w:rPr>
+              <w:t>🎙️ DECIR EN PARALELO (LO QUE DICES):</w:t>
+            </w:r>
+          </w:p>
+          <w:p>
+            <w:pPr>
+              <w:spacing w:after="0" w:line="276" w:lineRule="auto"/>
+            </w:pPr>
+            <w:r>
+              <w:rPr>
+                <w:i/>
+                <w:sz w:val="20"/>
+              </w:rPr>
+              <w:t>"Iniciamos sesión. El backend responde con la cookie HttpOnly que contiene el token JWT y el sistema nos da la bienvenida con un cartel Toast flotante."</w:t>
+            </w:r>
+          </w:p>
+        </w:tc>
+      </w:tr>
+    </w:tbl>
+    <w:p>
+      <w:pPr>
+        <w:spacing w:after="160"/>
+      </w:pPr>
+    </w:p>
+    <w:p>
+      <w:pPr>
+        <w:spacing w:before="280" w:after="80"/>
+      </w:pPr>
+      <w:r>
+        <w:rPr>
+          <w:b/>
+          <w:color w:val="92400E"/>
+          <w:sz w:val="24"/>
+        </w:rPr>
+        <w:t>Paso 10: Búsqueda, Filtro y Paginación en Servidor</w:t>
+      </w:r>
+    </w:p>
+    <w:tbl>
+      <w:tblPr>
+        <w:tblW w:type="auto" w:w="0"/>
+        <w:jc w:val="center"/>
+        <w:tblLayout w:type="fixed"/>
+        <w:tblLook w:firstColumn="1" w:firstRow="1" w:lastColumn="0" w:lastRow="0" w:noHBand="0" w:noVBand="1" w:val="04A0"/>
+      </w:tblPr>
+      <w:tblGrid>
+        <w:gridCol w:w="9360"/>
+      </w:tblGrid>
+      <w:tr>
+        <w:tc>
+          <w:tcPr>
+            <w:tcW w:type="dxa" w:w="9360"/>
+            <w:shd w:fill="EFF6FF"/>
+            <w:tcMar>
+              <w:top w:w="80" w:type="dxa"/>
+              <w:bottom w:w="80" w:type="dxa"/>
+              <w:left w:w="120" w:type="dxa"/>
+              <w:right w:w="120" w:type="dxa"/>
+            </w:tcMar>
+          </w:tcPr>
+          <w:p>
+            <w:pPr>
+              <w:spacing w:after="40"/>
+            </w:pPr>
+            <w:r>
+              <w:rPr>
+                <w:b/>
+                <w:color w:val="1D4ED8"/>
+                <w:sz w:val="19"/>
+              </w:rPr>
+              <w:t xml:space="preserve">🖥️ EN PANTALLA (LO QUE HACES): </w:t>
+            </w:r>
+            <w:r>
+              <w:rPr>
+                <w:sz w:val="19"/>
+              </w:rPr>
+              <w:t>En el Catálogo escribí 'Burger' en el buscador y borralo. Hacé clic en la píldora 'Pizzas' y luego en 'Todas'. Mostrá los números de página al pie.</w:t>
+            </w:r>
+          </w:p>
+        </w:tc>
+      </w:tr>
+      <w:tr>
+        <w:tc>
+          <w:tcPr>
+            <w:tcW w:type="dxa" w:w="9360"/>
+            <w:shd w:fill="FEF3C7"/>
+            <w:tcMar>
+              <w:top w:w="100" w:type="dxa"/>
+              <w:bottom w:w="100" w:type="dxa"/>
+              <w:left w:w="140" w:type="dxa"/>
+              <w:right w:w="140" w:type="dxa"/>
+            </w:tcMar>
+          </w:tcPr>
+          <w:p>
+            <w:pPr>
+              <w:spacing w:after="40"/>
+            </w:pPr>
+            <w:r>
+              <w:rPr>
+                <w:b/>
+                <w:color w:val="B45309"/>
+                <w:sz w:val="19"/>
+              </w:rPr>
+              <w:t>🎙️ DECIR EN PARALELO (LO QUE DICES):</w:t>
+            </w:r>
+          </w:p>
+          <w:p>
+            <w:pPr>
+              <w:spacing w:after="0" w:line="276" w:lineRule="auto"/>
+            </w:pPr>
+            <w:r>
+              <w:rPr>
+                <w:i/>
+                <w:sz w:val="20"/>
+              </w:rPr>
+              <w:t>"En el catálogo consumimos la API mediante TanStack Query con paginación server-side por skip y limit. Probamos el buscador de texto en tiempo real y los filtros por categoría."</w:t>
+            </w:r>
+          </w:p>
+        </w:tc>
+      </w:tr>
+    </w:tbl>
+    <w:p>
+      <w:pPr>
+        <w:spacing w:after="160"/>
+      </w:pPr>
+    </w:p>
+    <w:p>
+      <w:pPr>
+        <w:spacing w:before="280" w:after="80"/>
+      </w:pPr>
+      <w:r>
+        <w:rPr>
+          <w:b/>
+          <w:color w:val="92400E"/>
+          <w:sz w:val="24"/>
+        </w:rPr>
+        <w:t>Paso 11: Agregar al Carrito y Mini Carrito Deslizable (Drawer)</w:t>
+      </w:r>
+    </w:p>
+    <w:tbl>
+      <w:tblPr>
+        <w:tblW w:type="auto" w:w="0"/>
+        <w:jc w:val="center"/>
+        <w:tblLayout w:type="fixed"/>
+        <w:tblLook w:firstColumn="1" w:firstRow="1" w:lastColumn="0" w:lastRow="0" w:noHBand="0" w:noVBand="1" w:val="04A0"/>
+      </w:tblPr>
+      <w:tblGrid>
+        <w:gridCol w:w="9360"/>
+      </w:tblGrid>
+      <w:tr>
+        <w:tc>
+          <w:tcPr>
+            <w:tcW w:type="dxa" w:w="9360"/>
+            <w:shd w:fill="EFF6FF"/>
+            <w:tcMar>
+              <w:top w:w="80" w:type="dxa"/>
+              <w:bottom w:w="80" w:type="dxa"/>
+              <w:left w:w="120" w:type="dxa"/>
+              <w:right w:w="120" w:type="dxa"/>
+            </w:tcMar>
+          </w:tcPr>
+          <w:p>
+            <w:pPr>
+              <w:spacing w:after="40"/>
+            </w:pPr>
+            <w:r>
+              <w:rPr>
+                <w:b/>
+                <w:color w:val="1D4ED8"/>
+                <w:sz w:val="19"/>
+              </w:rPr>
+              <w:t xml:space="preserve">🖥️ EN PANTALLA (LO QUE HACES): </w:t>
+            </w:r>
+            <w:r>
+              <w:rPr>
+                <w:sz w:val="19"/>
+              </w:rPr>
+              <w:t>Hacé clic en 'Agregar' en una hamburguesa y una pizza. Se abre el panel deslizante lateral derecho. Presioná el botón '+' para aumentar unidades y '-' para bajar.</w:t>
+            </w:r>
+          </w:p>
+        </w:tc>
+      </w:tr>
+      <w:tr>
+        <w:tc>
+          <w:tcPr>
+            <w:tcW w:type="dxa" w:w="9360"/>
+            <w:shd w:fill="FEF3C7"/>
+            <w:tcMar>
+              <w:top w:w="100" w:type="dxa"/>
+              <w:bottom w:w="100" w:type="dxa"/>
+              <w:left w:w="140" w:type="dxa"/>
+              <w:right w:w="140" w:type="dxa"/>
+            </w:tcMar>
+          </w:tcPr>
+          <w:p>
+            <w:pPr>
+              <w:spacing w:after="40"/>
+            </w:pPr>
+            <w:r>
+              <w:rPr>
+                <w:b/>
+                <w:color w:val="B45309"/>
+                <w:sz w:val="19"/>
+              </w:rPr>
+              <w:t>🎙️ DECIR EN PARALELO (LO QUE DICES):</w:t>
+            </w:r>
+          </w:p>
+          <w:p>
+            <w:pPr>
+              <w:spacing w:after="0" w:line="276" w:lineRule="auto"/>
+            </w:pPr>
+            <w:r>
+              <w:rPr>
+                <w:i/>
+                <w:sz w:val="20"/>
+              </w:rPr>
+              <w:t>"Al agregar un plato se despliega el Mini Carrito Deslizable, manteniendo el formato Single Page sin perder de vista el menú. Desde aquí podemos ajustar unidades en vivo respetando el stock disponible del local o saltar directo al checkout."</w:t>
+            </w:r>
+          </w:p>
+        </w:tc>
+      </w:tr>
+    </w:tbl>
+    <w:p>
+      <w:pPr>
+        <w:spacing w:after="160"/>
+      </w:pPr>
+    </w:p>
+    <w:p>
+      <w:pPr>
+        <w:spacing w:before="280" w:after="80"/>
+      </w:pPr>
+      <w:r>
+        <w:rPr>
+          <w:b/>
+          <w:color w:val="92400E"/>
+          <w:sz w:val="24"/>
+        </w:rPr>
+        <w:t>Paso 12: Pantalla de Checkout y Validación de Dirección (RN-06)</w:t>
+      </w:r>
+    </w:p>
+    <w:tbl>
+      <w:tblPr>
+        <w:tblW w:type="auto" w:w="0"/>
+        <w:jc w:val="center"/>
+        <w:tblLayout w:type="fixed"/>
+        <w:tblLook w:firstColumn="1" w:firstRow="1" w:lastColumn="0" w:lastRow="0" w:noHBand="0" w:noVBand="1" w:val="04A0"/>
+      </w:tblPr>
+      <w:tblGrid>
+        <w:gridCol w:w="9360"/>
+      </w:tblGrid>
+      <w:tr>
+        <w:tc>
+          <w:tcPr>
+            <w:tcW w:type="dxa" w:w="9360"/>
+            <w:shd w:fill="EFF6FF"/>
+            <w:tcMar>
+              <w:top w:w="80" w:type="dxa"/>
+              <w:bottom w:w="80" w:type="dxa"/>
+              <w:left w:w="120" w:type="dxa"/>
+              <w:right w:w="120" w:type="dxa"/>
+            </w:tcMar>
+          </w:tcPr>
+          <w:p>
+            <w:pPr>
+              <w:spacing w:after="40"/>
+            </w:pPr>
+            <w:r>
+              <w:rPr>
+                <w:b/>
+                <w:color w:val="1D4ED8"/>
+                <w:sz w:val="19"/>
+              </w:rPr>
+              <w:t xml:space="preserve">🖥️ EN PANTALLA (LO QUE HACES): </w:t>
+            </w:r>
+            <w:r>
+              <w:rPr>
+                <w:sz w:val="19"/>
+              </w:rPr>
+              <w:t>En el drawer hacé clic en 'Pedir ahora' para ir a /checkout. Dejá la dirección vacía o escribí 'Av' (2 letras) y hacé clic en Confirmar. Mostrá el mensaje rojo de error.</w:t>
+            </w:r>
+          </w:p>
+        </w:tc>
+      </w:tr>
+      <w:tr>
+        <w:tc>
+          <w:tcPr>
+            <w:tcW w:type="dxa" w:w="9360"/>
+            <w:shd w:fill="FEF3C7"/>
+            <w:tcMar>
+              <w:top w:w="100" w:type="dxa"/>
+              <w:bottom w:w="100" w:type="dxa"/>
+              <w:left w:w="140" w:type="dxa"/>
+              <w:right w:w="140" w:type="dxa"/>
+            </w:tcMar>
+          </w:tcPr>
+          <w:p>
+            <w:pPr>
+              <w:spacing w:after="40"/>
+            </w:pPr>
+            <w:r>
+              <w:rPr>
+                <w:b/>
+                <w:color w:val="B45309"/>
+                <w:sz w:val="19"/>
+              </w:rPr>
+              <w:t>🎙️ DECIR EN PARALELO (LO QUE DICES):</w:t>
+            </w:r>
+          </w:p>
+          <w:p>
+            <w:pPr>
+              <w:spacing w:after="0" w:line="276" w:lineRule="auto"/>
+            </w:pPr>
+            <w:r>
+              <w:rPr>
+                <w:i/>
+                <w:sz w:val="20"/>
+              </w:rPr>
+              <w:t>"Avanzamos al Checkout. Si la dirección de entrega tiene menos de 5 caracteres, TanStack Form bloquea el envío de forma inmediata, validando la regla de negocio RN-06 para garantizar la correcta logística."</w:t>
+            </w:r>
+          </w:p>
+        </w:tc>
+      </w:tr>
+    </w:tbl>
+    <w:p>
+      <w:pPr>
+        <w:spacing w:after="160"/>
+      </w:pPr>
+    </w:p>
+    <w:p>
+      <w:pPr>
+        <w:spacing w:before="280" w:after="80"/>
+      </w:pPr>
+      <w:r>
+        <w:rPr>
+          <w:b/>
+          <w:color w:val="92400E"/>
+          <w:sz w:val="24"/>
+        </w:rPr>
+        <w:t>Paso 13: Confirmación de Pedido y Transaccionalidad (RN-01)</w:t>
+      </w:r>
+    </w:p>
+    <w:tbl>
+      <w:tblPr>
+        <w:tblW w:type="auto" w:w="0"/>
+        <w:jc w:val="center"/>
+        <w:tblLayout w:type="fixed"/>
+        <w:tblLook w:firstColumn="1" w:firstRow="1" w:lastColumn="0" w:lastRow="0" w:noHBand="0" w:noVBand="1" w:val="04A0"/>
+      </w:tblPr>
+      <w:tblGrid>
+        <w:gridCol w:w="9360"/>
+      </w:tblGrid>
+      <w:tr>
+        <w:tc>
+          <w:tcPr>
+            <w:tcW w:type="dxa" w:w="9360"/>
+            <w:shd w:fill="EFF6FF"/>
+            <w:tcMar>
+              <w:top w:w="80" w:type="dxa"/>
+              <w:bottom w:w="80" w:type="dxa"/>
+              <w:left w:w="120" w:type="dxa"/>
+              <w:right w:w="120" w:type="dxa"/>
+            </w:tcMar>
+          </w:tcPr>
+          <w:p>
+            <w:pPr>
+              <w:spacing w:after="40"/>
+            </w:pPr>
+            <w:r>
+              <w:rPr>
+                <w:b/>
+                <w:color w:val="1D4ED8"/>
+                <w:sz w:val="19"/>
+              </w:rPr>
+              <w:t xml:space="preserve">🖥️ EN PANTALLA (LO QUE HACES): </w:t>
+            </w:r>
+            <w:r>
+              <w:rPr>
+                <w:sz w:val="19"/>
+              </w:rPr>
+              <w:t>Escribí una dirección válida (ej: 'Av. San Martín 1234, Dpto 2B'), elegí la tarjeta de pago 'Efectivo', escribí en notas 'Tocar timbre 2B' y hacé clic en 'Confirmar y Realizar Pedido'.</w:t>
+            </w:r>
+          </w:p>
+        </w:tc>
+      </w:tr>
+      <w:tr>
+        <w:tc>
+          <w:tcPr>
+            <w:tcW w:type="dxa" w:w="9360"/>
+            <w:shd w:fill="FEF3C7"/>
+            <w:tcMar>
+              <w:top w:w="100" w:type="dxa"/>
+              <w:bottom w:w="100" w:type="dxa"/>
+              <w:left w:w="140" w:type="dxa"/>
+              <w:right w:w="140" w:type="dxa"/>
+            </w:tcMar>
+          </w:tcPr>
+          <w:p>
+            <w:pPr>
+              <w:spacing w:after="40"/>
+            </w:pPr>
+            <w:r>
+              <w:rPr>
+                <w:b/>
+                <w:color w:val="B45309"/>
+                <w:sz w:val="19"/>
+              </w:rPr>
+              <w:t>🎙️ DECIR EN PARALELO (LO QUE DICES):</w:t>
+            </w:r>
+          </w:p>
+          <w:p>
+            <w:pPr>
+              <w:spacing w:after="0" w:line="276" w:lineRule="auto"/>
+            </w:pPr>
+            <w:r>
+              <w:rPr>
+                <w:i/>
+                <w:sz w:val="20"/>
+              </w:rPr>
+              <w:t>"Ingresamos una dirección válida, seleccionamos pago en Efectivo y confirmamos. El backend procesa la orden de forma transaccional con Unit of Work según la regla RN-01: descuenta el stock atómicamente, vacía el carrito y nos redirige a Mis Pedidos."</w:t>
+            </w:r>
+          </w:p>
+        </w:tc>
+      </w:tr>
+    </w:tbl>
+    <w:p>
+      <w:pPr>
+        <w:spacing w:after="160"/>
+      </w:pPr>
+    </w:p>
+    <w:p>
+      <w:pPr>
+        <w:spacing w:before="280" w:after="80"/>
+      </w:pPr>
+      <w:r>
+        <w:rPr>
+          <w:b/>
+          <w:color w:val="92400E"/>
+          <w:sz w:val="24"/>
+        </w:rPr>
+        <w:t>Paso 14: Mis Pedidos e Inmutabilidad de Líneas (RN-02)</w:t>
+      </w:r>
+    </w:p>
+    <w:tbl>
+      <w:tblPr>
+        <w:tblW w:type="auto" w:w="0"/>
+        <w:jc w:val="center"/>
+        <w:tblLayout w:type="fixed"/>
+        <w:tblLook w:firstColumn="1" w:firstRow="1" w:lastColumn="0" w:lastRow="0" w:noHBand="0" w:noVBand="1" w:val="04A0"/>
+      </w:tblPr>
+      <w:tblGrid>
+        <w:gridCol w:w="9360"/>
+      </w:tblGrid>
+      <w:tr>
+        <w:tc>
+          <w:tcPr>
+            <w:tcW w:type="dxa" w:w="9360"/>
+            <w:shd w:fill="EFF6FF"/>
+            <w:tcMar>
+              <w:top w:w="80" w:type="dxa"/>
+              <w:bottom w:w="80" w:type="dxa"/>
+              <w:left w:w="120" w:type="dxa"/>
+              <w:right w:w="120" w:type="dxa"/>
+            </w:tcMar>
+          </w:tcPr>
+          <w:p>
+            <w:pPr>
+              <w:spacing w:after="40"/>
+            </w:pPr>
+            <w:r>
+              <w:rPr>
+                <w:b/>
+                <w:color w:val="1D4ED8"/>
+                <w:sz w:val="19"/>
+              </w:rPr>
+              <w:t xml:space="preserve">🖥️ EN PANTALLA (LO QUE HACES): </w:t>
+            </w:r>
+            <w:r>
+              <w:rPr>
+                <w:sz w:val="19"/>
+              </w:rPr>
+              <w:t>En /mis-pedidos, mostrá la orden creada con badge 'PENDIENTE'. Hacé clic en 'Ver detalle' para desplegar los artículos ordenados.</w:t>
+            </w:r>
+          </w:p>
+        </w:tc>
+      </w:tr>
+      <w:tr>
+        <w:tc>
+          <w:tcPr>
+            <w:tcW w:type="dxa" w:w="9360"/>
+            <w:shd w:fill="FEF3C7"/>
+            <w:tcMar>
+              <w:top w:w="100" w:type="dxa"/>
+              <w:bottom w:w="100" w:type="dxa"/>
+              <w:left w:w="140" w:type="dxa"/>
+              <w:right w:w="140" w:type="dxa"/>
+            </w:tcMar>
+          </w:tcPr>
+          <w:p>
+            <w:pPr>
+              <w:spacing w:after="40"/>
+            </w:pPr>
+            <w:r>
+              <w:rPr>
+                <w:b/>
+                <w:color w:val="B45309"/>
+                <w:sz w:val="19"/>
+              </w:rPr>
+              <w:t>🎙️ DECIR EN PARALELO (LO QUE DICES):</w:t>
+            </w:r>
+          </w:p>
+          <w:p>
+            <w:pPr>
+              <w:spacing w:after="0" w:line="276" w:lineRule="auto"/>
+            </w:pPr>
+            <w:r>
+              <w:rPr>
+                <w:i/>
+                <w:sz w:val="20"/>
+              </w:rPr>
+              <w:t>"Llegamos a 'Mis Pedidos'. Al desplegar la orden comprobamos la regla RN-02: cada ítem conserva su precio unitario y nombre histórico inmutable, protegiendo el comprobante del cliente ante futuros aumentos en el catálogo."</w:t>
+            </w:r>
+          </w:p>
+        </w:tc>
+      </w:tr>
+    </w:tbl>
+    <w:p>
+      <w:pPr>
+        <w:spacing w:after="160"/>
+      </w:pPr>
+    </w:p>
+    <w:p>
+      <w:pPr>
+        <w:spacing w:before="280" w:after="80"/>
+      </w:pPr>
+      <w:r>
+        <w:rPr>
+          <w:b/>
+          <w:color w:val="92400E"/>
+          <w:sz w:val="24"/>
+        </w:rPr>
+        <w:t>Paso 15: Cancelación de Pedido y Devolución de Stock (RN-05)</w:t>
+      </w:r>
+    </w:p>
+    <w:tbl>
+      <w:tblPr>
+        <w:tblW w:type="auto" w:w="0"/>
+        <w:jc w:val="center"/>
+        <w:tblLayout w:type="fixed"/>
+        <w:tblLook w:firstColumn="1" w:firstRow="1" w:lastColumn="0" w:lastRow="0" w:noHBand="0" w:noVBand="1" w:val="04A0"/>
+      </w:tblPr>
+      <w:tblGrid>
+        <w:gridCol w:w="9360"/>
+      </w:tblGrid>
+      <w:tr>
+        <w:tc>
+          <w:tcPr>
+            <w:tcW w:type="dxa" w:w="9360"/>
+            <w:shd w:fill="EFF6FF"/>
+            <w:tcMar>
+              <w:top w:w="80" w:type="dxa"/>
+              <w:bottom w:w="80" w:type="dxa"/>
+              <w:left w:w="120" w:type="dxa"/>
+              <w:right w:w="120" w:type="dxa"/>
+            </w:tcMar>
+          </w:tcPr>
+          <w:p>
+            <w:pPr>
+              <w:spacing w:after="40"/>
+            </w:pPr>
+            <w:r>
+              <w:rPr>
+                <w:b/>
+                <w:color w:val="1D4ED8"/>
+                <w:sz w:val="19"/>
+              </w:rPr>
+              <w:t xml:space="preserve">🖥️ EN PANTALLA (LO QUE HACES): </w:t>
+            </w:r>
+            <w:r>
+              <w:rPr>
+                <w:sz w:val="19"/>
+              </w:rPr>
+              <w:t>Hacé clic en el botón rojo 'Cancelar Pedido'. Se abre el modal de confirmación. Hacé clic en 'Sí, cancelar pedido'. Mostrá que el badge cambia a 'CANCELADO' y salta el Toast.</w:t>
+            </w:r>
+          </w:p>
+        </w:tc>
+      </w:tr>
+      <w:tr>
+        <w:tc>
+          <w:tcPr>
+            <w:tcW w:type="dxa" w:w="9360"/>
+            <w:shd w:fill="FEF3C7"/>
+            <w:tcMar>
+              <w:top w:w="100" w:type="dxa"/>
+              <w:bottom w:w="100" w:type="dxa"/>
+              <w:left w:w="140" w:type="dxa"/>
+              <w:right w:w="140" w:type="dxa"/>
+            </w:tcMar>
+          </w:tcPr>
+          <w:p>
+            <w:pPr>
+              <w:spacing w:after="40"/>
+            </w:pPr>
+            <w:r>
+              <w:rPr>
+                <w:b/>
+                <w:color w:val="B45309"/>
+                <w:sz w:val="19"/>
+              </w:rPr>
+              <w:t>🎙️ DECIR EN PARALELO (LO QUE DICES):</w:t>
+            </w:r>
+          </w:p>
+          <w:p>
+            <w:pPr>
+              <w:spacing w:after="0" w:line="276" w:lineRule="auto"/>
+            </w:pPr>
+            <w:r>
+              <w:rPr>
+                <w:i/>
+                <w:sz w:val="20"/>
+              </w:rPr>
+              <w:t>"Cumpliendo la regla RN-05, como el pedido está en estado PENDIENTE, la cancelación está permitida. Confirmamos en el modal, la orden pasa a CANCELADO y el backend reintegra automáticamente las cantidades al stock de la tienda."</w:t>
+            </w:r>
+          </w:p>
+        </w:tc>
+      </w:tr>
+    </w:tbl>
+    <w:p>
+      <w:pPr>
+        <w:spacing w:after="160"/>
+      </w:pPr>
+    </w:p>
+    <w:p>
+      <w:pPr>
+        <w:spacing w:before="280" w:after="80"/>
+      </w:pPr>
+      <w:r>
+        <w:rPr>
+          <w:b/>
+          <w:color w:val="92400E"/>
+          <w:sz w:val="24"/>
+        </w:rPr>
+        <w:t>Paso 16: Cierre de Sesión y Login como Administrador</w:t>
+      </w:r>
+    </w:p>
+    <w:tbl>
+      <w:tblPr>
+        <w:tblW w:type="auto" w:w="0"/>
+        <w:jc w:val="center"/>
+        <w:tblLayout w:type="fixed"/>
+        <w:tblLook w:firstColumn="1" w:firstRow="1" w:lastColumn="0" w:lastRow="0" w:noHBand="0" w:noVBand="1" w:val="04A0"/>
+      </w:tblPr>
+      <w:tblGrid>
+        <w:gridCol w:w="9360"/>
+      </w:tblGrid>
+      <w:tr>
+        <w:tc>
+          <w:tcPr>
+            <w:tcW w:type="dxa" w:w="9360"/>
+            <w:shd w:fill="EFF6FF"/>
+            <w:tcMar>
+              <w:top w:w="80" w:type="dxa"/>
+              <w:bottom w:w="80" w:type="dxa"/>
+              <w:left w:w="120" w:type="dxa"/>
+              <w:right w:w="120" w:type="dxa"/>
+            </w:tcMar>
+          </w:tcPr>
+          <w:p>
+            <w:pPr>
+              <w:spacing w:after="40"/>
+            </w:pPr>
+            <w:r>
+              <w:rPr>
+                <w:b/>
+                <w:color w:val="1D4ED8"/>
+                <w:sz w:val="19"/>
+              </w:rPr>
+              <w:t xml:space="preserve">🖥️ EN PANTALLA (LO QUE HACES): </w:t>
+            </w:r>
+            <w:r>
+              <w:rPr>
+                <w:sz w:val="19"/>
+              </w:rPr>
+              <w:t>En el Navbar hacé clic en el botón de Logout. Andá a /login, hacé clic en el botón demo 'Admin (admin / Admin1234!)' e ingresá.</w:t>
+            </w:r>
+          </w:p>
+        </w:tc>
+      </w:tr>
+      <w:tr>
+        <w:tc>
+          <w:tcPr>
+            <w:tcW w:type="dxa" w:w="9360"/>
+            <w:shd w:fill="FEF3C7"/>
+            <w:tcMar>
+              <w:top w:w="100" w:type="dxa"/>
+              <w:bottom w:w="100" w:type="dxa"/>
+              <w:left w:w="140" w:type="dxa"/>
+              <w:right w:w="140" w:type="dxa"/>
+            </w:tcMar>
+          </w:tcPr>
+          <w:p>
+            <w:pPr>
+              <w:spacing w:after="40"/>
+            </w:pPr>
+            <w:r>
+              <w:rPr>
+                <w:b/>
+                <w:color w:val="B45309"/>
+                <w:sz w:val="19"/>
+              </w:rPr>
+              <w:t>🎙️ DECIR EN PARALELO (LO QUE DICES):</w:t>
+            </w:r>
+          </w:p>
+          <w:p>
+            <w:pPr>
+              <w:spacing w:after="0" w:line="276" w:lineRule="auto"/>
+            </w:pPr>
+            <w:r>
+              <w:rPr>
+                <w:i/>
+                <w:sz w:val="20"/>
+              </w:rPr>
+              <w:t>"Cerramos la sesión del cliente y ahora ingresamos con la cuenta de Administrador. El guardián de rutas detecta el rol 'admin' y nos dirige automáticamente al Panel de Control."</w:t>
+            </w:r>
+          </w:p>
+        </w:tc>
+      </w:tr>
+    </w:tbl>
+    <w:p>
+      <w:pPr>
+        <w:spacing w:after="160"/>
+      </w:pPr>
+    </w:p>
+    <w:p>
+      <w:pPr>
+        <w:spacing w:before="280" w:after="80"/>
+      </w:pPr>
+      <w:r>
+        <w:rPr>
+          <w:b/>
+          <w:color w:val="92400E"/>
+          <w:sz w:val="24"/>
+        </w:rPr>
+        <w:t>Paso 17: Pestaña Resumen y Métricas en Tiempo Real</w:t>
+      </w:r>
+    </w:p>
+    <w:tbl>
+      <w:tblPr>
+        <w:tblW w:type="auto" w:w="0"/>
+        <w:jc w:val="center"/>
+        <w:tblLayout w:type="fixed"/>
+        <w:tblLook w:firstColumn="1" w:firstRow="1" w:lastColumn="0" w:lastRow="0" w:noHBand="0" w:noVBand="1" w:val="04A0"/>
+      </w:tblPr>
+      <w:tblGrid>
+        <w:gridCol w:w="9360"/>
+      </w:tblGrid>
+      <w:tr>
+        <w:tc>
+          <w:tcPr>
+            <w:tcW w:type="dxa" w:w="9360"/>
+            <w:shd w:fill="EFF6FF"/>
+            <w:tcMar>
+              <w:top w:w="80" w:type="dxa"/>
+              <w:bottom w:w="80" w:type="dxa"/>
+              <w:left w:w="120" w:type="dxa"/>
+              <w:right w:w="120" w:type="dxa"/>
+            </w:tcMar>
+          </w:tcPr>
+          <w:p>
+            <w:pPr>
+              <w:spacing w:after="40"/>
+            </w:pPr>
+            <w:r>
+              <w:rPr>
+                <w:b/>
+                <w:color w:val="1D4ED8"/>
+                <w:sz w:val="19"/>
+              </w:rPr>
+              <w:t xml:space="preserve">🖥️ EN PANTALLA (LO QUE HACES): </w:t>
+            </w:r>
+            <w:r>
+              <w:rPr>
+                <w:sz w:val="19"/>
+              </w:rPr>
+              <w:t>Mostrá la pantalla /admin/resumen con las 6 tarjetas de métricas (Ingresos entregados, pedidos de hoy, en preparación, pendientes, entregados, cancelados).</w:t>
+            </w:r>
+          </w:p>
+        </w:tc>
+      </w:tr>
+      <w:tr>
+        <w:tc>
+          <w:tcPr>
+            <w:tcW w:type="dxa" w:w="9360"/>
+            <w:shd w:fill="FEF3C7"/>
+            <w:tcMar>
+              <w:top w:w="100" w:type="dxa"/>
+              <w:bottom w:w="100" w:type="dxa"/>
+              <w:left w:w="140" w:type="dxa"/>
+              <w:right w:w="140" w:type="dxa"/>
+            </w:tcMar>
+          </w:tcPr>
+          <w:p>
+            <w:pPr>
+              <w:spacing w:after="40"/>
+            </w:pPr>
+            <w:r>
+              <w:rPr>
+                <w:b/>
+                <w:color w:val="B45309"/>
+                <w:sz w:val="19"/>
+              </w:rPr>
+              <w:t>🎙️ DECIR EN PARALELO (LO QUE DICES):</w:t>
+            </w:r>
+          </w:p>
+          <w:p>
+            <w:pPr>
+              <w:spacing w:after="0" w:line="276" w:lineRule="auto"/>
+            </w:pPr>
+            <w:r>
+              <w:rPr>
+                <w:i/>
+                <w:sz w:val="20"/>
+              </w:rPr>
+              <w:t>"En la pestaña 'Resumen' el administrador visualiza los indicadores del negocio en tiempo real: facturación total de órdenes entregadas, volumen de pedidos del día y estado de cocina."</w:t>
+            </w:r>
+          </w:p>
+        </w:tc>
+      </w:tr>
+    </w:tbl>
+    <w:p>
+      <w:pPr>
+        <w:spacing w:after="160"/>
+      </w:pPr>
+    </w:p>
+    <w:p>
+      <w:pPr>
+        <w:spacing w:before="280" w:after="80"/>
+      </w:pPr>
+      <w:r>
+        <w:rPr>
+          <w:b/>
+          <w:color w:val="92400E"/>
+          <w:sz w:val="24"/>
+        </w:rPr>
+        <w:t>Paso 18: Gestión de Pedidos y Máquina de Estados (RN-03)</w:t>
+      </w:r>
+    </w:p>
+    <w:tbl>
+      <w:tblPr>
+        <w:tblW w:type="auto" w:w="0"/>
+        <w:jc w:val="center"/>
+        <w:tblLayout w:type="fixed"/>
+        <w:tblLook w:firstColumn="1" w:firstRow="1" w:lastColumn="0" w:lastRow="0" w:noHBand="0" w:noVBand="1" w:val="04A0"/>
+      </w:tblPr>
+      <w:tblGrid>
+        <w:gridCol w:w="9360"/>
+      </w:tblGrid>
+      <w:tr>
+        <w:tc>
+          <w:tcPr>
+            <w:tcW w:type="dxa" w:w="9360"/>
+            <w:shd w:fill="EFF6FF"/>
+            <w:tcMar>
+              <w:top w:w="80" w:type="dxa"/>
+              <w:bottom w:w="80" w:type="dxa"/>
+              <w:left w:w="120" w:type="dxa"/>
+              <w:right w:w="120" w:type="dxa"/>
+            </w:tcMar>
+          </w:tcPr>
+          <w:p>
+            <w:pPr>
+              <w:spacing w:after="40"/>
+            </w:pPr>
+            <w:r>
+              <w:rPr>
+                <w:b/>
+                <w:color w:val="1D4ED8"/>
+                <w:sz w:val="19"/>
+              </w:rPr>
+              <w:t xml:space="preserve">🖥️ EN PANTALLA (LO QUE HACES): </w:t>
+            </w:r>
+            <w:r>
+              <w:rPr>
+                <w:sz w:val="19"/>
+              </w:rPr>
+              <w:t>Hacé clic en la pestaña 'Pedidos' (/admin/pedidos). Ubicá una orden PENDIENTE y hacé clic en 'Preparar' (pasa a EN_PREPARACION). Luego en esa misma orden hacé clic en 'Marcar Entregado' (pasa a ENTREGADO).</w:t>
+            </w:r>
+          </w:p>
+        </w:tc>
+      </w:tr>
+      <w:tr>
+        <w:tc>
+          <w:tcPr>
+            <w:tcW w:type="dxa" w:w="9360"/>
+            <w:shd w:fill="FEF3C7"/>
+            <w:tcMar>
+              <w:top w:w="100" w:type="dxa"/>
+              <w:bottom w:w="100" w:type="dxa"/>
+              <w:left w:w="140" w:type="dxa"/>
+              <w:right w:w="140" w:type="dxa"/>
+            </w:tcMar>
+          </w:tcPr>
+          <w:p>
+            <w:pPr>
+              <w:spacing w:after="40"/>
+            </w:pPr>
+            <w:r>
+              <w:rPr>
+                <w:b/>
+                <w:color w:val="B45309"/>
+                <w:sz w:val="19"/>
+              </w:rPr>
+              <w:t>🎙️ DECIR EN PARALELO (LO QUE DICES):</w:t>
+            </w:r>
+          </w:p>
+          <w:p>
+            <w:pPr>
+              <w:spacing w:after="0" w:line="276" w:lineRule="auto"/>
+            </w:pPr>
+            <w:r>
+              <w:rPr>
+                <w:i/>
+                <w:sz w:val="20"/>
+              </w:rPr>
+              <w:t>"Pasamos a 'Pedidos'. Aquí opera la regla RN-03 con la máquina de estados: una orden PENDIENTE solo puede pasar a EN_PREPARACION o cancelarse. Al estar en cocina, la marcamos como ENTREGADO. Una vez entregada o cancelada, entra en un estado final que no admite modificaciones."</w:t>
+            </w:r>
+          </w:p>
+        </w:tc>
+      </w:tr>
+    </w:tbl>
+    <w:p>
+      <w:pPr>
+        <w:spacing w:after="160"/>
+      </w:pPr>
+    </w:p>
+    <w:p>
+      <w:pPr>
+        <w:spacing w:before="280" w:after="80"/>
+      </w:pPr>
+      <w:r>
+        <w:rPr>
+          <w:b/>
+          <w:color w:val="92400E"/>
+          <w:sz w:val="24"/>
+        </w:rPr>
+        <w:t>Paso 19: ABM de Categorías con TanStack Table y TanStack Form</w:t>
+      </w:r>
+    </w:p>
+    <w:tbl>
+      <w:tblPr>
+        <w:tblW w:type="auto" w:w="0"/>
+        <w:jc w:val="center"/>
+        <w:tblLayout w:type="fixed"/>
+        <w:tblLook w:firstColumn="1" w:firstRow="1" w:lastColumn="0" w:lastRow="0" w:noHBand="0" w:noVBand="1" w:val="04A0"/>
+      </w:tblPr>
+      <w:tblGrid>
+        <w:gridCol w:w="9360"/>
+      </w:tblGrid>
+      <w:tr>
+        <w:tc>
+          <w:tcPr>
+            <w:tcW w:type="dxa" w:w="9360"/>
+            <w:shd w:fill="EFF6FF"/>
+            <w:tcMar>
+              <w:top w:w="80" w:type="dxa"/>
+              <w:bottom w:w="80" w:type="dxa"/>
+              <w:left w:w="120" w:type="dxa"/>
+              <w:right w:w="120" w:type="dxa"/>
+            </w:tcMar>
+          </w:tcPr>
+          <w:p>
+            <w:pPr>
+              <w:spacing w:after="40"/>
+            </w:pPr>
+            <w:r>
+              <w:rPr>
+                <w:b/>
+                <w:color w:val="1D4ED8"/>
+                <w:sz w:val="19"/>
+              </w:rPr>
+              <w:t xml:space="preserve">🖥️ EN PANTALLA (LO QUE HACES): </w:t>
+            </w:r>
+            <w:r>
+              <w:rPr>
+                <w:sz w:val="19"/>
+              </w:rPr>
+              <w:t>Hacé clic en 'Categorías' (/admin/categorias). Escribí en el buscador de la tabla para filtrar. Hacé clic en 'Nueva Categoría', completá nombre 'Postres Caseros' y guardá.</w:t>
+            </w:r>
+          </w:p>
+        </w:tc>
+      </w:tr>
+      <w:tr>
+        <w:tc>
+          <w:tcPr>
+            <w:tcW w:type="dxa" w:w="9360"/>
+            <w:shd w:fill="FEF3C7"/>
+            <w:tcMar>
+              <w:top w:w="100" w:type="dxa"/>
+              <w:bottom w:w="100" w:type="dxa"/>
+              <w:left w:w="140" w:type="dxa"/>
+              <w:right w:w="140" w:type="dxa"/>
+            </w:tcMar>
+          </w:tcPr>
+          <w:p>
+            <w:pPr>
+              <w:spacing w:after="40"/>
+            </w:pPr>
+            <w:r>
+              <w:rPr>
+                <w:b/>
+                <w:color w:val="B45309"/>
+                <w:sz w:val="19"/>
+              </w:rPr>
+              <w:t>🎙️ DECIR EN PARALELO (LO QUE DICES):</w:t>
+            </w:r>
+          </w:p>
+          <w:p>
+            <w:pPr>
+              <w:spacing w:after="0" w:line="276" w:lineRule="auto"/>
+            </w:pPr>
+            <w:r>
+              <w:rPr>
+                <w:i/>
+                <w:sz w:val="20"/>
+              </w:rPr>
+              <w:t>"En 'Categorías' implementamos TanStack Table para ordenamiento y filtrado en el cliente. Abrimos el modal con TanStack Form, damos de alta una categoría y vemos cómo se actualiza la tabla reactivamente."</w:t>
+            </w:r>
+          </w:p>
+        </w:tc>
+      </w:tr>
+    </w:tbl>
+    <w:p>
+      <w:pPr>
+        <w:spacing w:after="160"/>
+      </w:pPr>
+    </w:p>
+    <w:p>
+      <w:pPr>
+        <w:spacing w:before="280" w:after="80"/>
+      </w:pPr>
+      <w:r>
+        <w:rPr>
+          <w:b/>
+          <w:color w:val="92400E"/>
+          <w:sz w:val="24"/>
+        </w:rPr>
+        <w:t>Paso 20: ABM de Productos, Edición Rápida de Stock y Disponibilidad</w:t>
+      </w:r>
+    </w:p>
+    <w:tbl>
+      <w:tblPr>
+        <w:tblW w:type="auto" w:w="0"/>
+        <w:jc w:val="center"/>
+        <w:tblLayout w:type="fixed"/>
+        <w:tblLook w:firstColumn="1" w:firstRow="1" w:lastColumn="0" w:lastRow="0" w:noHBand="0" w:noVBand="1" w:val="04A0"/>
+      </w:tblPr>
+      <w:tblGrid>
+        <w:gridCol w:w="9360"/>
+      </w:tblGrid>
+      <w:tr>
+        <w:tc>
+          <w:tcPr>
+            <w:tcW w:type="dxa" w:w="9360"/>
+            <w:shd w:fill="EFF6FF"/>
+            <w:tcMar>
+              <w:top w:w="80" w:type="dxa"/>
+              <w:bottom w:w="80" w:type="dxa"/>
+              <w:left w:w="120" w:type="dxa"/>
+              <w:right w:w="120" w:type="dxa"/>
+            </w:tcMar>
+          </w:tcPr>
+          <w:p>
+            <w:pPr>
+              <w:spacing w:after="40"/>
+            </w:pPr>
+            <w:r>
+              <w:rPr>
+                <w:b/>
+                <w:color w:val="1D4ED8"/>
+                <w:sz w:val="19"/>
+              </w:rPr>
+              <w:t xml:space="preserve">🖥️ EN PANTALLA (LO QUE HACES): </w:t>
+            </w:r>
+            <w:r>
+              <w:rPr>
+                <w:sz w:val="19"/>
+              </w:rPr>
+              <w:t>Hacé clic en 'Productos' (/admin/productos). En un plato, presioná los botones '+' y '-' de la columna de Stock. Luego hacé clic en el badge 'Disponible' para pausarlo.</w:t>
+            </w:r>
+          </w:p>
+        </w:tc>
+      </w:tr>
+      <w:tr>
+        <w:tc>
+          <w:tcPr>
+            <w:tcW w:type="dxa" w:w="9360"/>
+            <w:shd w:fill="FEF3C7"/>
+            <w:tcMar>
+              <w:top w:w="100" w:type="dxa"/>
+              <w:bottom w:w="100" w:type="dxa"/>
+              <w:left w:w="140" w:type="dxa"/>
+              <w:right w:w="140" w:type="dxa"/>
+            </w:tcMar>
+          </w:tcPr>
+          <w:p>
+            <w:pPr>
+              <w:spacing w:after="40"/>
+            </w:pPr>
+            <w:r>
+              <w:rPr>
+                <w:b/>
+                <w:color w:val="B45309"/>
+                <w:sz w:val="19"/>
+              </w:rPr>
+              <w:t>🎙️ DECIR EN PARALELO (LO QUE DICES):</w:t>
+            </w:r>
+          </w:p>
+          <w:p>
+            <w:pPr>
+              <w:spacing w:after="0" w:line="276" w:lineRule="auto"/>
+            </w:pPr>
+            <w:r>
+              <w:rPr>
+                <w:i/>
+                <w:sz w:val="20"/>
+              </w:rPr>
+              <w:t>"En 'Productos' gestionamos los platos. Observen esta función clave: la edición rápida de stock inline. Con los botones más y menos modificamos el inventario en un clic vía PATCH sin abrir formularios, y con el switch pausamos la disponibilidad del plato para que no figure en el menú."</w:t>
+            </w:r>
+          </w:p>
+        </w:tc>
+      </w:tr>
+    </w:tbl>
+    <w:p>
+      <w:pPr>
+        <w:spacing w:after="160"/>
+      </w:pPr>
+    </w:p>
+    <w:p>
+      <w:pPr>
+        <w:spacing w:before="280" w:after="80"/>
+      </w:pPr>
+      <w:r>
+        <w:rPr>
+          <w:b/>
+          <w:color w:val="92400E"/>
+          <w:sz w:val="24"/>
+        </w:rPr>
+        <w:t>Paso 21: Gestión de Usuarios y Regla de Seguridad</w:t>
+      </w:r>
+    </w:p>
+    <w:tbl>
+      <w:tblPr>
+        <w:tblW w:type="auto" w:w="0"/>
+        <w:jc w:val="center"/>
+        <w:tblLayout w:type="fixed"/>
+        <w:tblLook w:firstColumn="1" w:firstRow="1" w:lastColumn="0" w:lastRow="0" w:noHBand="0" w:noVBand="1" w:val="04A0"/>
+      </w:tblPr>
+      <w:tblGrid>
+        <w:gridCol w:w="9360"/>
+      </w:tblGrid>
+      <w:tr>
+        <w:tc>
+          <w:tcPr>
+            <w:tcW w:type="dxa" w:w="9360"/>
+            <w:shd w:fill="EFF6FF"/>
+            <w:tcMar>
+              <w:top w:w="80" w:type="dxa"/>
+              <w:bottom w:w="80" w:type="dxa"/>
+              <w:left w:w="120" w:type="dxa"/>
+              <w:right w:w="120" w:type="dxa"/>
+            </w:tcMar>
+          </w:tcPr>
+          <w:p>
+            <w:pPr>
+              <w:spacing w:after="40"/>
+            </w:pPr>
+            <w:r>
+              <w:rPr>
+                <w:b/>
+                <w:color w:val="1D4ED8"/>
+                <w:sz w:val="19"/>
+              </w:rPr>
+              <w:t xml:space="preserve">🖥️ EN PANTALLA (LO QUE HACES): </w:t>
+            </w:r>
+            <w:r>
+              <w:rPr>
+                <w:sz w:val="19"/>
+              </w:rPr>
+              <w:t>Hacé clic en 'Usuarios' (/admin/usuarios). Mostrá la tabla y señalá que en tu fila de 'admin' el botón dice 'Protegido' (deshabilitado). Luego desactivá y activá al usuario 'cliente'.</w:t>
+            </w:r>
+          </w:p>
+        </w:tc>
+      </w:tr>
+      <w:tr>
+        <w:tc>
+          <w:tcPr>
+            <w:tcW w:type="dxa" w:w="9360"/>
+            <w:shd w:fill="FEF3C7"/>
+            <w:tcMar>
+              <w:top w:w="100" w:type="dxa"/>
+              <w:bottom w:w="100" w:type="dxa"/>
+              <w:left w:w="140" w:type="dxa"/>
+              <w:right w:w="140" w:type="dxa"/>
+            </w:tcMar>
+          </w:tcPr>
+          <w:p>
+            <w:pPr>
+              <w:spacing w:after="40"/>
+            </w:pPr>
+            <w:r>
+              <w:rPr>
+                <w:b/>
+                <w:color w:val="B45309"/>
+                <w:sz w:val="19"/>
+              </w:rPr>
+              <w:t>🎙️ DECIR EN PARALELO (LO QUE DICES):</w:t>
+            </w:r>
+          </w:p>
+          <w:p>
+            <w:pPr>
+              <w:spacing w:after="0" w:line="276" w:lineRule="auto"/>
+            </w:pPr>
+            <w:r>
+              <w:rPr>
+                <w:i/>
+                <w:sz w:val="20"/>
+              </w:rPr>
+              <w:t>"En 'Usuarios' controlamos el acceso. Noten la regla de seguridad: el sistema bloquea el botón de auto-desactivación para el administrador que tiene la sesión iniciada, evitando que el panel quede inaccesible por error."</w:t>
+            </w:r>
+          </w:p>
+        </w:tc>
+      </w:tr>
+    </w:tbl>
+    <w:p>
+      <w:pPr>
+        <w:spacing w:after="160"/>
+      </w:pPr>
+    </w:p>
+    <w:p>
+      <w:pPr>
+        <w:spacing w:before="280" w:after="80"/>
+      </w:pPr>
+      <w:r>
+        <w:rPr>
+          <w:b/>
+          <w:color w:val="92400E"/>
+          <w:sz w:val="24"/>
+        </w:rPr>
+        <w:t>Paso 22: Revisión de Código: Unit of Work y Seguridad de Sesión</w:t>
+      </w:r>
+    </w:p>
+    <w:tbl>
+      <w:tblPr>
+        <w:tblW w:type="auto" w:w="0"/>
+        <w:jc w:val="center"/>
+        <w:tblLayout w:type="fixed"/>
+        <w:tblLook w:firstColumn="1" w:firstRow="1" w:lastColumn="0" w:lastRow="0" w:noHBand="0" w:noVBand="1" w:val="04A0"/>
+      </w:tblPr>
+      <w:tblGrid>
+        <w:gridCol w:w="9360"/>
+      </w:tblGrid>
+      <w:tr>
+        <w:tc>
+          <w:tcPr>
+            <w:tcW w:type="dxa" w:w="9360"/>
+            <w:shd w:fill="EFF6FF"/>
+            <w:tcMar>
+              <w:top w:w="80" w:type="dxa"/>
+              <w:bottom w:w="80" w:type="dxa"/>
+              <w:left w:w="120" w:type="dxa"/>
+              <w:right w:w="120" w:type="dxa"/>
+            </w:tcMar>
+          </w:tcPr>
+          <w:p>
+            <w:pPr>
+              <w:spacing w:after="40"/>
+            </w:pPr>
+            <w:r>
+              <w:rPr>
+                <w:b/>
+                <w:color w:val="1D4ED8"/>
+                <w:sz w:val="19"/>
+              </w:rPr>
+              <w:t xml:space="preserve">🖥️ EN PANTALLA (LO QUE HACES): </w:t>
+            </w:r>
+            <w:r>
+              <w:rPr>
+                <w:sz w:val="19"/>
+              </w:rPr>
+              <w:t>En VS Code abrí 'backend/app/core/unit_of_work.py' y mostrá los métodos __enter__ y __exit__. Luego abrí 'frontend/src/store/authStore.ts' y mostrá 'partialize'.</w:t>
+            </w:r>
+          </w:p>
+        </w:tc>
+      </w:tr>
+      <w:tr>
+        <w:tc>
+          <w:tcPr>
+            <w:tcW w:type="dxa" w:w="9360"/>
+            <w:shd w:fill="FEF3C7"/>
+            <w:tcMar>
+              <w:top w:w="100" w:type="dxa"/>
+              <w:bottom w:w="100" w:type="dxa"/>
+              <w:left w:w="140" w:type="dxa"/>
+              <w:right w:w="140" w:type="dxa"/>
+            </w:tcMar>
+          </w:tcPr>
+          <w:p>
+            <w:pPr>
+              <w:spacing w:after="40"/>
+            </w:pPr>
+            <w:r>
+              <w:rPr>
+                <w:b/>
+                <w:color w:val="B45309"/>
+                <w:sz w:val="19"/>
+              </w:rPr>
+              <w:t>🎙️ DECIR EN PARALELO (LO QUE DICES):</w:t>
+            </w:r>
+          </w:p>
+          <w:p>
+            <w:pPr>
+              <w:spacing w:after="0" w:line="276" w:lineRule="auto"/>
+            </w:pPr>
+            <w:r>
+              <w:rPr>
+                <w:i/>
+                <w:sz w:val="20"/>
+              </w:rPr>
+              <w:t>"Para cerrar, repasamos dos puntos clave del código: en 'unit_of_work.py' implementamos el context manager transaccional con commit y rollback automático ante cualquier error. Y en el frontend, 'authStore.ts' utiliza partialize guardando únicamente el perfil; los tokens jamás tocan localStorage y viajan seguros en la cookie HttpOnly."</w:t>
+            </w:r>
+          </w:p>
+        </w:tc>
+      </w:tr>
+    </w:tbl>
+    <w:p>
+      <w:pPr>
+        <w:spacing w:after="160"/>
+      </w:pPr>
+    </w:p>
+    <w:p>
+      <w:pPr>
+        <w:spacing w:before="280" w:after="80"/>
+      </w:pPr>
+      <w:r>
+        <w:rPr>
+          <w:b/>
+          <w:color w:val="92400E"/>
+          <w:sz w:val="24"/>
+        </w:rPr>
+        <w:t>Paso 23: Empaquetado de Entrega (.zip) y Repositorio GitHub</w:t>
+      </w:r>
+    </w:p>
+    <w:tbl>
+      <w:tblPr>
+        <w:tblW w:type="auto" w:w="0"/>
+        <w:jc w:val="center"/>
+        <w:tblLayout w:type="fixed"/>
+        <w:tblLook w:firstColumn="1" w:firstRow="1" w:lastColumn="0" w:lastRow="0" w:noHBand="0" w:noVBand="1" w:val="04A0"/>
+      </w:tblPr>
+      <w:tblGrid>
+        <w:gridCol w:w="9360"/>
+      </w:tblGrid>
+      <w:tr>
+        <w:tc>
+          <w:tcPr>
+            <w:tcW w:type="dxa" w:w="9360"/>
+            <w:shd w:fill="EFF6FF"/>
+            <w:tcMar>
+              <w:top w:w="80" w:type="dxa"/>
+              <w:bottom w:w="80" w:type="dxa"/>
+              <w:left w:w="120" w:type="dxa"/>
+              <w:right w:w="120" w:type="dxa"/>
+            </w:tcMar>
+          </w:tcPr>
+          <w:p>
+            <w:pPr>
+              <w:spacing w:after="40"/>
+            </w:pPr>
+            <w:r>
+              <w:rPr>
+                <w:b/>
+                <w:color w:val="1D4ED8"/>
+                <w:sz w:val="19"/>
+              </w:rPr>
+              <w:t xml:space="preserve">🖥️ EN PANTALLA (LO QUE HACES): </w:t>
+            </w:r>
+            <w:r>
+              <w:rPr>
+                <w:sz w:val="19"/>
+              </w:rPr>
+              <w:t>En la terminal raíz ejecutá: powershell -ExecutionPolicy Bypass -File scripts/empaquetar_entrega.ps1. Mostrá el ZIP de 0.88 MB generado. Luego mostrá en Chrome el repo con los 11 issues cerrados.</w:t>
+            </w:r>
+          </w:p>
+        </w:tc>
+      </w:tr>
+      <w:tr>
+        <w:tc>
+          <w:tcPr>
+            <w:tcW w:type="dxa" w:w="9360"/>
+            <w:shd w:fill="FEF3C7"/>
+            <w:tcMar>
+              <w:top w:w="100" w:type="dxa"/>
+              <w:bottom w:w="100" w:type="dxa"/>
+              <w:left w:w="140" w:type="dxa"/>
+              <w:right w:w="140" w:type="dxa"/>
+            </w:tcMar>
+          </w:tcPr>
+          <w:p>
+            <w:pPr>
+              <w:spacing w:after="40"/>
+            </w:pPr>
+            <w:r>
+              <w:rPr>
+                <w:b/>
+                <w:color w:val="B45309"/>
+                <w:sz w:val="19"/>
+              </w:rPr>
+              <w:t>🎙️ DECIR EN PARALELO (LO QUE DICES):</w:t>
+            </w:r>
+          </w:p>
+          <w:p>
+            <w:pPr>
+              <w:spacing w:after="0" w:line="276" w:lineRule="auto"/>
+            </w:pPr>
+            <w:r>
+              <w:rPr>
+                <w:i/>
+                <w:sz w:val="20"/>
+              </w:rPr>
+              <w:t>"Finalmente, ejecutamos el script de empaquetado que genera el archivo 'TPI-Food_Store-Brian_Emanuel_Rios.zip' de menos de 1 MB, excluyendo node_modules, entornos virtuales y secretos locales, cumpliendo las pautas CE-01 a CE-07. Con todos los commits y los 11 issues cerrados en GitHub, concluyo mi presentación. Muchas gracias."</w:t>
+            </w:r>
+          </w:p>
+        </w:tc>
+      </w:tr>
+    </w:tbl>
+    <w:p>
+      <w:pPr>
+        <w:spacing w:after="160"/>
       </w:pPr>
     </w:p>
     <w:sectPr>

</xml_diff>